<commit_message>
docs(guide): remove double bullets and fix list formatting in PhilSMS manual docx
</commit_message>
<xml_diff>
--- a/docs/11-09-2026_TapNQue_Comprehensive_System_Guide_and_PhilSMS_Manual.docx
+++ b/docs/11-09-2026_TapNQue_Comprehensive_System_Guide_and_PhilSMS_Manual.docx
@@ -166,7 +166,7 @@
           <w:color w:val="000000"/>
           <w:sz w:val="22"/>
         </w:rPr>
-        <w:t xml:space="preserve">• </w:t>
+        <w:t xml:space="preserve">Student Touchscreen Kiosk (src/tapnque/ui/kiosk.py / run_kiosk.py): </w:t>
       </w:r>
       <w:r>
         <w:rPr>
@@ -174,7 +174,7 @@
           <w:color w:val="000000"/>
           <w:sz w:val="22"/>
         </w:rPr>
-        <w:t>Student Touchscreen Kiosk (src/tapnque/ui/kiosk.py / run_kiosk.py): Self-service registration terminal collecting student credentials, mobile numbers, and visit purposes.</w:t>
+        <w:t>Self-service registration terminal collecting student credentials, mobile numbers, and visit purposes.</w:t>
       </w:r>
     </w:p>
     <w:p>
@@ -189,7 +189,7 @@
           <w:color w:val="000000"/>
           <w:sz w:val="22"/>
         </w:rPr>
-        <w:t xml:space="preserve">• </w:t>
+        <w:t xml:space="preserve">Staff Admin Service Desk (src/tapnque/ui/staff.py / run_staff.py): </w:t>
       </w:r>
       <w:r>
         <w:rPr>
@@ -197,7 +197,7 @@
           <w:color w:val="000000"/>
           <w:sz w:val="22"/>
         </w:rPr>
-        <w:t>Staff Admin Service Desk (src/tapnque/ui/staff.py / run_staff.py): Service desk terminal enabling counter staff to call the next prioritized ticket, recall absentees, and mark transactions complete.</w:t>
+        <w:t>Service desk terminal enabling counter staff to call the next prioritized ticket, recall absentees, and mark transactions complete.</w:t>
       </w:r>
     </w:p>
     <w:p>
@@ -212,7 +212,7 @@
           <w:color w:val="000000"/>
           <w:sz w:val="22"/>
         </w:rPr>
-        <w:t xml:space="preserve">• </w:t>
+        <w:t xml:space="preserve">Super Admin Executive Console (src/tapnque/ui/super_admin.py / run_admin.py): </w:t>
       </w:r>
       <w:r>
         <w:rPr>
@@ -220,7 +220,7 @@
           <w:color w:val="000000"/>
           <w:sz w:val="22"/>
         </w:rPr>
-        <w:t>Super Admin Executive Console (src/tapnque/ui/super_admin.py / run_admin.py): Operational command center providing live analytics, queue diagnostic controls, PhilSMS gateway credentials, mock simulation audit logs, and data management tools.</w:t>
+        <w:t>Operational command center providing live analytics, queue diagnostic controls, PhilSMS gateway credentials, mock simulation audit logs, and data management tools.</w:t>
       </w:r>
     </w:p>
     <w:p>
@@ -235,7 +235,7 @@
           <w:color w:val="000000"/>
           <w:sz w:val="22"/>
         </w:rPr>
-        <w:t xml:space="preserve">• </w:t>
+        <w:t xml:space="preserve">Public TV / Lobby Monitor (src/tapnque/ui/monitor.py / run_monitor.py): </w:t>
       </w:r>
       <w:r>
         <w:rPr>
@@ -243,7 +243,7 @@
           <w:color w:val="000000"/>
           <w:sz w:val="22"/>
         </w:rPr>
-        <w:t>Public TV / Lobby Monitor (src/tapnque/ui/monitor.py / run_monitor.py): Fullscreen lobby display board rendering high-contrast counter status cards, active ticket numbers, waiting queues, and visual flashing call announcements.</w:t>
+        <w:t>Fullscreen lobby display board rendering high-contrast counter status cards, active ticket numbers, waiting queues, and visual flashing call announcements.</w:t>
       </w:r>
     </w:p>
     <w:p>
@@ -258,7 +258,7 @@
           <w:color w:val="000000"/>
           <w:sz w:val="22"/>
         </w:rPr>
-        <w:t xml:space="preserve">• </w:t>
+        <w:t xml:space="preserve">Core Database Engine (src/tapnque/core/database.py): </w:t>
       </w:r>
       <w:r>
         <w:rPr>
@@ -266,7 +266,7 @@
           <w:color w:val="000000"/>
           <w:sz w:val="22"/>
         </w:rPr>
-        <w:t>Core Database Engine (src/tapnque/core/database.py): Thread-safe SQLite database manager operating in Write-Ahead Logging (WAL) mode with automated schema migration.</w:t>
+        <w:t>Thread-safe SQLite database manager operating in Write-Ahead Logging (WAL) mode with automated schema migration.</w:t>
       </w:r>
     </w:p>
     <w:p>
@@ -281,7 +281,7 @@
           <w:color w:val="000000"/>
           <w:sz w:val="22"/>
         </w:rPr>
-        <w:t xml:space="preserve">• </w:t>
+        <w:t xml:space="preserve">PhilSMS Notification Gateway (src/tapnque/services/sms_service.py): </w:t>
       </w:r>
       <w:r>
         <w:rPr>
@@ -289,7 +289,7 @@
           <w:color w:val="000000"/>
           <w:sz w:val="22"/>
         </w:rPr>
-        <w:t>PhilSMS Notification Gateway (src/tapnque/services/sms_service.py): Pure software SMS service with Philippine phone sanitization, asynchronous daemon queueing, Bearer token authorization, and offline defense simulation.</w:t>
+        <w:t>Pure software SMS service with Philippine phone sanitization, asynchronous daemon queueing, Bearer token authorization, and offline defense simulation.</w:t>
       </w:r>
     </w:p>
     <w:p>
@@ -338,8 +338,8 @@
     </w:p>
     <w:p>
       <w:pPr>
-        <w:pStyle w:val="ListBullet"/>
-        <w:spacing w:line="276" w:lineRule="auto" w:before="0" w:after="60"/>
+        <w:spacing w:line="276" w:lineRule="auto" w:before="0" w:after="70"/>
+        <w:ind w:left="504" w:hanging="504"/>
       </w:pPr>
       <w:r>
         <w:rPr>
@@ -348,7 +348,17 @@
           <w:color w:val="000000"/>
           <w:sz w:val="22"/>
         </w:rPr>
-        <w:t xml:space="preserve">1. </w:t>
+        <w:t>1.</w:t>
+        <w:tab/>
+      </w:r>
+      <w:r>
+        <w:rPr>
+          <w:rFonts w:ascii="Times New Roman" w:hAnsi="Times New Roman"/>
+          <w:b/>
+          <w:color w:val="000000"/>
+          <w:sz w:val="22"/>
+        </w:rPr>
+        <w:t xml:space="preserve">Animated Startup Sequence: </w:t>
       </w:r>
       <w:r>
         <w:rPr>
@@ -356,13 +366,13 @@
           <w:color w:val="000000"/>
           <w:sz w:val="22"/>
         </w:rPr>
-        <w:t>Animated Startup Sequence: Implements LoadingScreen with progressive campus service synchronization checks before revealing the check-in interface. Startup timer can be bypassed with Escape, Return, or Space.</w:t>
+        <w:t>Implements LoadingScreen with progressive campus service synchronization checks before revealing the check-in interface. Startup timer can be bypassed with Escape, Return, or Space.</w:t>
       </w:r>
     </w:p>
     <w:p>
       <w:pPr>
-        <w:pStyle w:val="ListBullet"/>
-        <w:spacing w:line="276" w:lineRule="auto" w:before="0" w:after="60"/>
+        <w:spacing w:line="276" w:lineRule="auto" w:before="0" w:after="70"/>
+        <w:ind w:left="504" w:hanging="504"/>
       </w:pPr>
       <w:r>
         <w:rPr>
@@ -371,7 +381,17 @@
           <w:color w:val="000000"/>
           <w:sz w:val="22"/>
         </w:rPr>
-        <w:t xml:space="preserve">2. </w:t>
+        <w:t>2.</w:t>
+        <w:tab/>
+      </w:r>
+      <w:r>
+        <w:rPr>
+          <w:rFonts w:ascii="Times New Roman" w:hAnsi="Times New Roman"/>
+          <w:b/>
+          <w:color w:val="000000"/>
+          <w:sz w:val="22"/>
+        </w:rPr>
+        <w:t xml:space="preserve">Touch-Optimized Registration Form: </w:t>
       </w:r>
       <w:r>
         <w:rPr>
@@ -379,13 +399,13 @@
           <w:color w:val="000000"/>
           <w:sz w:val="22"/>
         </w:rPr>
-        <w:t>Touch-Optimized Registration Form: Gathers Student Name, Student Number (formatted as 2023-00000), Email Address, Philippine Mobile Number, Visitor Type, and Purpose of Visit.</w:t>
+        <w:t>Gathers Student Name, Student Number (formatted as 2023-00000), Email Address, Philippine Mobile Number, Visitor Type, and Purpose of Visit.</w:t>
       </w:r>
     </w:p>
     <w:p>
       <w:pPr>
-        <w:pStyle w:val="ListBullet"/>
-        <w:spacing w:line="276" w:lineRule="auto" w:before="0" w:after="60"/>
+        <w:spacing w:line="276" w:lineRule="auto" w:before="0" w:after="70"/>
+        <w:ind w:left="504" w:hanging="504"/>
       </w:pPr>
       <w:r>
         <w:rPr>
@@ -394,7 +414,17 @@
           <w:color w:val="000000"/>
           <w:sz w:val="22"/>
         </w:rPr>
-        <w:t xml:space="preserve">3. </w:t>
+        <w:t>3.</w:t>
+        <w:tab/>
+      </w:r>
+      <w:r>
+        <w:rPr>
+          <w:rFonts w:ascii="Times New Roman" w:hAnsi="Times New Roman"/>
+          <w:b/>
+          <w:color w:val="000000"/>
+          <w:sz w:val="22"/>
+        </w:rPr>
+        <w:t xml:space="preserve">Dynamic Virtual Keyboard: </w:t>
       </w:r>
       <w:r>
         <w:rPr>
@@ -402,13 +432,13 @@
           <w:color w:val="000000"/>
           <w:sz w:val="22"/>
         </w:rPr>
-        <w:t>Dynamic Virtual Keyboard: An integrated on-screen keyboard (TouchKeyboardWidget) slides up upon input focus, dynamically toggling between QWERTY ('alpha') and numeric keypad ('numeric') modes.</w:t>
+        <w:t>An integrated on-screen keyboard (TouchKeyboardWidget) slides up upon input focus, dynamically toggling between QWERTY ('alpha') and numeric keypad ('numeric') modes.</w:t>
       </w:r>
     </w:p>
     <w:p>
       <w:pPr>
-        <w:pStyle w:val="ListBullet"/>
-        <w:spacing w:line="276" w:lineRule="auto" w:before="0" w:after="60"/>
+        <w:spacing w:line="276" w:lineRule="auto" w:before="0" w:after="70"/>
+        <w:ind w:left="504" w:hanging="504"/>
       </w:pPr>
       <w:r>
         <w:rPr>
@@ -417,7 +447,17 @@
           <w:color w:val="000000"/>
           <w:sz w:val="22"/>
         </w:rPr>
-        <w:t xml:space="preserve">4. </w:t>
+        <w:t>4.</w:t>
+        <w:tab/>
+      </w:r>
+      <w:r>
+        <w:rPr>
+          <w:rFonts w:ascii="Times New Roman" w:hAnsi="Times New Roman"/>
+          <w:b/>
+          <w:color w:val="000000"/>
+          <w:sz w:val="22"/>
+        </w:rPr>
+        <w:t xml:space="preserve">Philippine Mobile Sanitization: </w:t>
       </w:r>
       <w:r>
         <w:rPr>
@@ -425,13 +465,13 @@
           <w:color w:val="000000"/>
           <w:sz w:val="22"/>
         </w:rPr>
-        <w:t>Philippine Mobile Sanitization: Mobile numbers are verified via sanitize_ph_phone_number(), normalizing valid inputs into canonical 11-digit format (09XXXXXXXXX) while rejecting malformed inputs.</w:t>
+        <w:t>Mobile numbers are verified via sanitize_ph_phone_number(), normalizing valid inputs into canonical 11-digit format (09XXXXXXXXX) while rejecting malformed inputs.</w:t>
       </w:r>
     </w:p>
     <w:p>
       <w:pPr>
-        <w:pStyle w:val="ListBullet"/>
-        <w:spacing w:line="276" w:lineRule="auto" w:before="0" w:after="60"/>
+        <w:spacing w:line="276" w:lineRule="auto" w:before="0" w:after="70"/>
+        <w:ind w:left="504" w:hanging="504"/>
       </w:pPr>
       <w:r>
         <w:rPr>
@@ -440,7 +480,17 @@
           <w:color w:val="000000"/>
           <w:sz w:val="22"/>
         </w:rPr>
-        <w:t xml:space="preserve">5. </w:t>
+        <w:t>5.</w:t>
+        <w:tab/>
+      </w:r>
+      <w:r>
+        <w:rPr>
+          <w:rFonts w:ascii="Times New Roman" w:hAnsi="Times New Roman"/>
+          <w:b/>
+          <w:color w:val="000000"/>
+          <w:sz w:val="22"/>
+        </w:rPr>
+        <w:t xml:space="preserve">Priority Classification Matrix: </w:t>
       </w:r>
       <w:r>
         <w:rPr>
@@ -448,13 +498,13 @@
           <w:color w:val="000000"/>
           <w:sz w:val="22"/>
         </w:rPr>
-        <w:t>Priority Classification Matrix: PWD visitors are automatically assigned 'High Priority', Parents and Guardians receive 'Priority', and standard Students receive FIFO 'Standard' queuing.</w:t>
+        <w:t>PWD visitors are automatically assigned 'High Priority', Parents and Guardians receive 'Priority', and standard Students receive FIFO 'Standard' queuing.</w:t>
       </w:r>
     </w:p>
     <w:p>
       <w:pPr>
-        <w:pStyle w:val="ListBullet"/>
-        <w:spacing w:line="276" w:lineRule="auto" w:before="0" w:after="60"/>
+        <w:spacing w:line="276" w:lineRule="auto" w:before="0" w:after="70"/>
+        <w:ind w:left="504" w:hanging="504"/>
       </w:pPr>
       <w:r>
         <w:rPr>
@@ -463,7 +513,17 @@
           <w:color w:val="000000"/>
           <w:sz w:val="22"/>
         </w:rPr>
-        <w:t xml:space="preserve">6. </w:t>
+        <w:t>6.</w:t>
+        <w:tab/>
+      </w:r>
+      <w:r>
+        <w:rPr>
+          <w:rFonts w:ascii="Times New Roman" w:hAnsi="Times New Roman"/>
+          <w:b/>
+          <w:color w:val="000000"/>
+          <w:sz w:val="22"/>
+        </w:rPr>
+        <w:t xml:space="preserve">Confirmation Modal &amp; Auto-Reset: </w:t>
       </w:r>
       <w:r>
         <w:rPr>
@@ -471,7 +531,7 @@
           <w:color w:val="000000"/>
           <w:sz w:val="22"/>
         </w:rPr>
-        <w:t>Confirmation Modal &amp; Auto-Reset: TicketCreatedDialog displays the generated 4-digit ticket number, queue position, purpose, and confirmation pills ('Email sent • SMS dispatched successfully') with an 8-second auto-dismiss timer.</w:t>
+        <w:t>TicketCreatedDialog displays the generated 4-digit ticket number, queue position, purpose, and confirmation pills ('Email sent • SMS dispatched successfully') with an 8-second auto-dismiss timer.</w:t>
       </w:r>
     </w:p>
     <w:p>
@@ -505,8 +565,8 @@
     </w:p>
     <w:p>
       <w:pPr>
-        <w:pStyle w:val="ListBullet"/>
-        <w:spacing w:line="276" w:lineRule="auto" w:before="0" w:after="60"/>
+        <w:spacing w:line="276" w:lineRule="auto" w:before="0" w:after="70"/>
+        <w:ind w:left="504" w:hanging="504"/>
       </w:pPr>
       <w:r>
         <w:rPr>
@@ -515,7 +575,17 @@
           <w:color w:val="000000"/>
           <w:sz w:val="22"/>
         </w:rPr>
-        <w:t xml:space="preserve">1. </w:t>
+        <w:t>1.</w:t>
+        <w:tab/>
+      </w:r>
+      <w:r>
+        <w:rPr>
+          <w:rFonts w:ascii="Times New Roman" w:hAnsi="Times New Roman"/>
+          <w:b/>
+          <w:color w:val="000000"/>
+          <w:sz w:val="22"/>
+        </w:rPr>
+        <w:t xml:space="preserve">Dynamic Counter Assignment: </w:t>
       </w:r>
       <w:r>
         <w:rPr>
@@ -523,13 +593,13 @@
           <w:color w:val="000000"/>
           <w:sz w:val="22"/>
         </w:rPr>
-        <w:t>Dynamic Counter Assignment: Dropdown selector allows the clerk to assign their workstation dynamically between Counter 1, Counter 2, Counter 3, and Counter 4.</w:t>
+        <w:t>Dropdown selector allows the clerk to assign their workstation dynamically between Counter 1, Counter 2, Counter 3, and Counter 4.</w:t>
       </w:r>
     </w:p>
     <w:p>
       <w:pPr>
-        <w:pStyle w:val="ListBullet"/>
-        <w:spacing w:line="276" w:lineRule="auto" w:before="0" w:after="60"/>
+        <w:spacing w:line="276" w:lineRule="auto" w:before="0" w:after="70"/>
+        <w:ind w:left="504" w:hanging="504"/>
       </w:pPr>
       <w:r>
         <w:rPr>
@@ -538,7 +608,17 @@
           <w:color w:val="000000"/>
           <w:sz w:val="22"/>
         </w:rPr>
-        <w:t xml:space="preserve">2. </w:t>
+        <w:t>2.</w:t>
+        <w:tab/>
+      </w:r>
+      <w:r>
+        <w:rPr>
+          <w:rFonts w:ascii="Times New Roman" w:hAnsi="Times New Roman"/>
+          <w:b/>
+          <w:color w:val="000000"/>
+          <w:sz w:val="22"/>
+        </w:rPr>
+        <w:t xml:space="preserve">Priority-Sorted Waiting Queue: </w:t>
       </w:r>
       <w:r>
         <w:rPr>
@@ -546,13 +626,13 @@
           <w:color w:val="000000"/>
           <w:sz w:val="22"/>
         </w:rPr>
-        <w:t>Priority-Sorted Waiting Queue: Real-time table refreshing every 3 seconds, ordering waiting tickets strictly by priority weight (Urgent -&gt; High -&gt; Priority -&gt; Standard) and chronological arrival.</w:t>
+        <w:t>Real-time table refreshing every 3 seconds, ordering waiting tickets strictly by priority weight (Urgent -&gt; High -&gt; Priority -&gt; Standard) and chronological arrival.</w:t>
       </w:r>
     </w:p>
     <w:p>
       <w:pPr>
-        <w:pStyle w:val="ListBullet"/>
-        <w:spacing w:line="276" w:lineRule="auto" w:before="0" w:after="60"/>
+        <w:spacing w:line="276" w:lineRule="auto" w:before="0" w:after="70"/>
+        <w:ind w:left="504" w:hanging="504"/>
       </w:pPr>
       <w:r>
         <w:rPr>
@@ -561,7 +641,17 @@
           <w:color w:val="000000"/>
           <w:sz w:val="22"/>
         </w:rPr>
-        <w:t xml:space="preserve">3. </w:t>
+        <w:t>3.</w:t>
+        <w:tab/>
+      </w:r>
+      <w:r>
+        <w:rPr>
+          <w:rFonts w:ascii="Times New Roman" w:hAnsi="Times New Roman"/>
+          <w:b/>
+          <w:color w:val="000000"/>
+          <w:sz w:val="22"/>
+        </w:rPr>
+        <w:t xml:space="preserve">Call Next Action: </w:t>
       </w:r>
       <w:r>
         <w:rPr>
@@ -569,13 +659,13 @@
           <w:color w:val="000000"/>
           <w:sz w:val="22"/>
         </w:rPr>
-        <w:t>Call Next Action: Pulls the highest-priority ticket from the queue, changes state from 'waiting' to 'serving', links the ticket to the current counter ID, timestamps called_at, and triggers automated PhilSMS and Email alerts.</w:t>
+        <w:t>Pulls the highest-priority ticket from the queue, changes state from 'waiting' to 'serving', links the ticket to the current counter ID, timestamps called_at, and triggers automated PhilSMS and Email alerts.</w:t>
       </w:r>
     </w:p>
     <w:p>
       <w:pPr>
-        <w:pStyle w:val="ListBullet"/>
-        <w:spacing w:line="276" w:lineRule="auto" w:before="0" w:after="60"/>
+        <w:spacing w:line="276" w:lineRule="auto" w:before="0" w:after="70"/>
+        <w:ind w:left="504" w:hanging="504"/>
       </w:pPr>
       <w:r>
         <w:rPr>
@@ -584,7 +674,17 @@
           <w:color w:val="000000"/>
           <w:sz w:val="22"/>
         </w:rPr>
-        <w:t xml:space="preserve">4. </w:t>
+        <w:t>4.</w:t>
+        <w:tab/>
+      </w:r>
+      <w:r>
+        <w:rPr>
+          <w:rFonts w:ascii="Times New Roman" w:hAnsi="Times New Roman"/>
+          <w:b/>
+          <w:color w:val="000000"/>
+          <w:sz w:val="22"/>
+        </w:rPr>
+        <w:t xml:space="preserve">Recall Action: </w:t>
       </w:r>
       <w:r>
         <w:rPr>
@@ -592,13 +692,13 @@
           <w:color w:val="000000"/>
           <w:sz w:val="22"/>
         </w:rPr>
-        <w:t>Recall Action: Re-triggers public monitor flashing alerts and dispatches an updated SMS notification to re-alert an absent student.</w:t>
+        <w:t>Re-triggers public monitor flashing alerts and dispatches an updated SMS notification to re-alert an absent student.</w:t>
       </w:r>
     </w:p>
     <w:p>
       <w:pPr>
-        <w:pStyle w:val="ListBullet"/>
-        <w:spacing w:line="276" w:lineRule="auto" w:before="0" w:after="60"/>
+        <w:spacing w:line="276" w:lineRule="auto" w:before="0" w:after="70"/>
+        <w:ind w:left="504" w:hanging="504"/>
       </w:pPr>
       <w:r>
         <w:rPr>
@@ -607,7 +707,17 @@
           <w:color w:val="000000"/>
           <w:sz w:val="22"/>
         </w:rPr>
-        <w:t xml:space="preserve">5. </w:t>
+        <w:t>5.</w:t>
+        <w:tab/>
+      </w:r>
+      <w:r>
+        <w:rPr>
+          <w:rFonts w:ascii="Times New Roman" w:hAnsi="Times New Roman"/>
+          <w:b/>
+          <w:color w:val="000000"/>
+          <w:sz w:val="22"/>
+        </w:rPr>
+        <w:t xml:space="preserve">Mark Done Action: </w:t>
       </w:r>
       <w:r>
         <w:rPr>
@@ -615,13 +725,13 @@
           <w:color w:val="000000"/>
           <w:sz w:val="22"/>
         </w:rPr>
-        <w:t>Mark Done Action: Concludes the active transaction, timestamps completed_at, calculates service wait time, updates historical statistics, and dispatches the final completion SMS.</w:t>
+        <w:t>Concludes the active transaction, timestamps completed_at, calculates service wait time, updates historical statistics, and dispatches the final completion SMS.</w:t>
       </w:r>
     </w:p>
     <w:p>
       <w:pPr>
-        <w:pStyle w:val="ListBullet"/>
-        <w:spacing w:line="276" w:lineRule="auto" w:before="0" w:after="60"/>
+        <w:spacing w:line="276" w:lineRule="auto" w:before="0" w:after="70"/>
+        <w:ind w:left="504" w:hanging="504"/>
       </w:pPr>
       <w:r>
         <w:rPr>
@@ -630,7 +740,17 @@
           <w:color w:val="000000"/>
           <w:sz w:val="22"/>
         </w:rPr>
-        <w:t xml:space="preserve">6. </w:t>
+        <w:t>6.</w:t>
+        <w:tab/>
+      </w:r>
+      <w:r>
+        <w:rPr>
+          <w:rFonts w:ascii="Times New Roman" w:hAnsi="Times New Roman"/>
+          <w:b/>
+          <w:color w:val="000000"/>
+          <w:sz w:val="22"/>
+        </w:rPr>
+        <w:t xml:space="preserve">Service History Inspection: </w:t>
       </w:r>
       <w:r>
         <w:rPr>
@@ -638,7 +758,7 @@
           <w:color w:val="000000"/>
           <w:sz w:val="22"/>
         </w:rPr>
-        <w:t>Service History Inspection: HistoryDialog displays the station's last 30 completed transactions with date, time, and student details.</w:t>
+        <w:t>HistoryDialog displays the station's last 30 completed transactions with date, time, and student details.</w:t>
       </w:r>
     </w:p>
     <w:p>
@@ -672,8 +792,8 @@
     </w:p>
     <w:p>
       <w:pPr>
-        <w:pStyle w:val="ListBullet"/>
-        <w:spacing w:line="276" w:lineRule="auto" w:before="0" w:after="60"/>
+        <w:spacing w:line="276" w:lineRule="auto" w:before="0" w:after="70"/>
+        <w:ind w:left="504" w:hanging="504"/>
       </w:pPr>
       <w:r>
         <w:rPr>
@@ -682,7 +802,17 @@
           <w:color w:val="000000"/>
           <w:sz w:val="22"/>
         </w:rPr>
-        <w:t xml:space="preserve">1. </w:t>
+        <w:t>1.</w:t>
+        <w:tab/>
+      </w:r>
+      <w:r>
+        <w:rPr>
+          <w:rFonts w:ascii="Times New Roman" w:hAnsi="Times New Roman"/>
+          <w:b/>
+          <w:color w:val="000000"/>
+          <w:sz w:val="22"/>
+        </w:rPr>
+        <w:t xml:space="preserve">Analytics &amp; Queue Telemetry (Tab 1): </w:t>
       </w:r>
       <w:r>
         <w:rPr>
@@ -690,13 +820,13 @@
           <w:color w:val="000000"/>
           <w:sz w:val="22"/>
         </w:rPr>
-        <w:t>Analytics &amp; Queue Telemetry (Tab 1): Displays StatCards for Total Served, Average Wait Time, Active Waiting, and Serving Counters, accompanied by a visual queue health gauge and wait-time distribution snapshot.</w:t>
+        <w:t>Displays StatCards for Total Served, Average Wait Time, Active Waiting, and Serving Counters, accompanied by a visual queue health gauge and wait-time distribution snapshot.</w:t>
       </w:r>
     </w:p>
     <w:p>
       <w:pPr>
-        <w:pStyle w:val="ListBullet"/>
-        <w:spacing w:line="276" w:lineRule="auto" w:before="0" w:after="60"/>
+        <w:spacing w:line="276" w:lineRule="auto" w:before="0" w:after="70"/>
+        <w:ind w:left="504" w:hanging="504"/>
       </w:pPr>
       <w:r>
         <w:rPr>
@@ -705,7 +835,17 @@
           <w:color w:val="000000"/>
           <w:sz w:val="22"/>
         </w:rPr>
-        <w:t xml:space="preserve">2. </w:t>
+        <w:t>2.</w:t>
+        <w:tab/>
+      </w:r>
+      <w:r>
+        <w:rPr>
+          <w:rFonts w:ascii="Times New Roman" w:hAnsi="Times New Roman"/>
+          <w:b/>
+          <w:color w:val="000000"/>
+          <w:sz w:val="22"/>
+        </w:rPr>
+        <w:t xml:space="preserve">Queue Monitor (Tab 2): </w:t>
       </w:r>
       <w:r>
         <w:rPr>
@@ -713,13 +853,13 @@
           <w:color w:val="000000"/>
           <w:sz w:val="22"/>
         </w:rPr>
-        <w:t>Queue Monitor (Tab 2): Consolidated multi-counter queue table showing all waiting and serving students with real-time wait times and status badges.</w:t>
+        <w:t>Consolidated multi-counter queue table showing all waiting and serving students with real-time wait times and status badges.</w:t>
       </w:r>
     </w:p>
     <w:p>
       <w:pPr>
-        <w:pStyle w:val="ListBullet"/>
-        <w:spacing w:line="276" w:lineRule="auto" w:before="0" w:after="60"/>
+        <w:spacing w:line="276" w:lineRule="auto" w:before="0" w:after="70"/>
+        <w:ind w:left="504" w:hanging="504"/>
       </w:pPr>
       <w:r>
         <w:rPr>
@@ -728,7 +868,17 @@
           <w:color w:val="000000"/>
           <w:sz w:val="22"/>
         </w:rPr>
-        <w:t xml:space="preserve">3. </w:t>
+        <w:t>3.</w:t>
+        <w:tab/>
+      </w:r>
+      <w:r>
+        <w:rPr>
+          <w:rFonts w:ascii="Times New Roman" w:hAnsi="Times New Roman"/>
+          <w:b/>
+          <w:color w:val="000000"/>
+          <w:sz w:val="22"/>
+        </w:rPr>
+        <w:t xml:space="preserve">Student Kiosk Settings: </w:t>
       </w:r>
       <w:r>
         <w:rPr>
@@ -736,13 +886,13 @@
           <w:color w:val="000000"/>
           <w:sz w:val="22"/>
         </w:rPr>
-        <w:t>Student Kiosk Settings: Master toggle allowing administrators to show or hide the phone number input field on the student registration kiosk.</w:t>
+        <w:t>Master toggle allowing administrators to show or hide the phone number input field on the student registration kiosk.</w:t>
       </w:r>
     </w:p>
     <w:p>
       <w:pPr>
-        <w:pStyle w:val="ListBullet"/>
-        <w:spacing w:line="276" w:lineRule="auto" w:before="0" w:after="60"/>
+        <w:spacing w:line="276" w:lineRule="auto" w:before="0" w:after="70"/>
+        <w:ind w:left="504" w:hanging="504"/>
       </w:pPr>
       <w:r>
         <w:rPr>
@@ -751,7 +901,17 @@
           <w:color w:val="000000"/>
           <w:sz w:val="22"/>
         </w:rPr>
-        <w:t xml:space="preserve">4. </w:t>
+        <w:t>4.</w:t>
+        <w:tab/>
+      </w:r>
+      <w:r>
+        <w:rPr>
+          <w:rFonts w:ascii="Times New Roman" w:hAnsi="Times New Roman"/>
+          <w:b/>
+          <w:color w:val="000000"/>
+          <w:sz w:val="22"/>
+        </w:rPr>
+        <w:t xml:space="preserve">PhilSMS Gateway Management: </w:t>
       </w:r>
       <w:r>
         <w:rPr>
@@ -759,13 +919,13 @@
           <w:color w:val="000000"/>
           <w:sz w:val="22"/>
         </w:rPr>
-        <w:t>PhilSMS Gateway Management: Full control over PhilSMS operations, including Live/Mock mode toggles, API Bearer Token configuration, Sender ID specification, and individual trigger controls.</w:t>
+        <w:t>Full control over PhilSMS operations, including Live/Mock mode toggles, API Bearer Token configuration, Sender ID specification, and individual trigger controls.</w:t>
       </w:r>
     </w:p>
     <w:p>
       <w:pPr>
-        <w:pStyle w:val="ListBullet"/>
-        <w:spacing w:line="276" w:lineRule="auto" w:before="0" w:after="60"/>
+        <w:spacing w:line="276" w:lineRule="auto" w:before="0" w:after="70"/>
+        <w:ind w:left="504" w:hanging="504"/>
       </w:pPr>
       <w:r>
         <w:rPr>
@@ -774,7 +934,17 @@
           <w:color w:val="000000"/>
           <w:sz w:val="22"/>
         </w:rPr>
-        <w:t xml:space="preserve">5. </w:t>
+        <w:t>5.</w:t>
+        <w:tab/>
+      </w:r>
+      <w:r>
+        <w:rPr>
+          <w:rFonts w:ascii="Times New Roman" w:hAnsi="Times New Roman"/>
+          <w:b/>
+          <w:color w:val="000000"/>
+          <w:sz w:val="22"/>
+        </w:rPr>
+        <w:t xml:space="preserve">Template Customization: </w:t>
       </w:r>
       <w:r>
         <w:rPr>
@@ -782,13 +952,13 @@
           <w:color w:val="000000"/>
           <w:sz w:val="22"/>
         </w:rPr>
-        <w:t>Template Customization: Dynamic message template editors supporting contextual replacement tags ({name}, {ticket}, {position}, {purpose}, {counter}).</w:t>
+        <w:t>Dynamic message template editors supporting contextual replacement tags ({name}, {ticket}, {position}, {purpose}, {counter}).</w:t>
       </w:r>
     </w:p>
     <w:p>
       <w:pPr>
-        <w:pStyle w:val="ListBullet"/>
-        <w:spacing w:line="276" w:lineRule="auto" w:before="0" w:after="60"/>
+        <w:spacing w:line="276" w:lineRule="auto" w:before="0" w:after="70"/>
+        <w:ind w:left="504" w:hanging="504"/>
       </w:pPr>
       <w:r>
         <w:rPr>
@@ -797,7 +967,17 @@
           <w:color w:val="000000"/>
           <w:sz w:val="22"/>
         </w:rPr>
-        <w:t xml:space="preserve">6. </w:t>
+        <w:t>6.</w:t>
+        <w:tab/>
+      </w:r>
+      <w:r>
+        <w:rPr>
+          <w:rFonts w:ascii="Times New Roman" w:hAnsi="Times New Roman"/>
+          <w:b/>
+          <w:color w:val="000000"/>
+          <w:sz w:val="22"/>
+        </w:rPr>
+        <w:t xml:space="preserve">Interactive Test Dispatch Tool: </w:t>
       </w:r>
       <w:r>
         <w:rPr>
@@ -805,13 +985,13 @@
           <w:color w:val="000000"/>
           <w:sz w:val="22"/>
         </w:rPr>
-        <w:t>Interactive Test Dispatch Tool: Allows administrators to send a test SMS to any valid Philippine mobile number, verifying live API credentials or mock simulation behavior.</w:t>
+        <w:t>Allows administrators to send a test SMS to any valid Philippine mobile number, verifying live API credentials or mock simulation behavior.</w:t>
       </w:r>
     </w:p>
     <w:p>
       <w:pPr>
-        <w:pStyle w:val="ListBullet"/>
-        <w:spacing w:line="276" w:lineRule="auto" w:before="0" w:after="60"/>
+        <w:spacing w:line="276" w:lineRule="auto" w:before="0" w:after="70"/>
+        <w:ind w:left="504" w:hanging="504"/>
       </w:pPr>
       <w:r>
         <w:rPr>
@@ -820,7 +1000,17 @@
           <w:color w:val="000000"/>
           <w:sz w:val="22"/>
         </w:rPr>
-        <w:t xml:space="preserve">7. </w:t>
+        <w:t>7.</w:t>
+        <w:tab/>
+      </w:r>
+      <w:r>
+        <w:rPr>
+          <w:rFonts w:ascii="Times New Roman" w:hAnsi="Times New Roman"/>
+          <w:b/>
+          <w:color w:val="000000"/>
+          <w:sz w:val="22"/>
+        </w:rPr>
+        <w:t xml:space="preserve">Mock SMS Log Inspector: </w:t>
       </w:r>
       <w:r>
         <w:rPr>
@@ -828,13 +1018,13 @@
           <w:color w:val="000000"/>
           <w:sz w:val="22"/>
         </w:rPr>
-        <w:t>Mock SMS Log Inspector: In-memory session audit viewer (SMSLogDialog) displaying the most recent 100 simulated SMS messages with timestamps, recipients, and content.</w:t>
+        <w:t>In-memory session audit viewer (SMSLogDialog) displaying the most recent 100 simulated SMS messages with timestamps, recipients, and content.</w:t>
       </w:r>
     </w:p>
     <w:p>
       <w:pPr>
-        <w:pStyle w:val="ListBullet"/>
-        <w:spacing w:line="276" w:lineRule="auto" w:before="0" w:after="60"/>
+        <w:spacing w:line="276" w:lineRule="auto" w:before="0" w:after="70"/>
+        <w:ind w:left="504" w:hanging="504"/>
       </w:pPr>
       <w:r>
         <w:rPr>
@@ -843,7 +1033,17 @@
           <w:color w:val="000000"/>
           <w:sz w:val="22"/>
         </w:rPr>
-        <w:t xml:space="preserve">8. </w:t>
+        <w:t>8.</w:t>
+        <w:tab/>
+      </w:r>
+      <w:r>
+        <w:rPr>
+          <w:rFonts w:ascii="Times New Roman" w:hAnsi="Times New Roman"/>
+          <w:b/>
+          <w:color w:val="000000"/>
+          <w:sz w:val="22"/>
+        </w:rPr>
+        <w:t xml:space="preserve">Database Maintenance: </w:t>
       </w:r>
       <w:r>
         <w:rPr>
@@ -851,7 +1051,7 @@
           <w:color w:val="000000"/>
           <w:sz w:val="22"/>
         </w:rPr>
-        <w:t>Database Maintenance: Dedicated maintenance actions to purge completed records, reset operational counters, and export database tables to JSON.</w:t>
+        <w:t>Dedicated maintenance actions to purge completed records, reset operational counters, and export database tables to JSON.</w:t>
       </w:r>
     </w:p>
     <w:p>
@@ -895,7 +1095,7 @@
           <w:color w:val="000000"/>
           <w:sz w:val="22"/>
         </w:rPr>
-        <w:t xml:space="preserve">• </w:t>
+        <w:t xml:space="preserve">High-Contrast Visual Layout: </w:t>
       </w:r>
       <w:r>
         <w:rPr>
@@ -903,7 +1103,7 @@
           <w:color w:val="000000"/>
           <w:sz w:val="22"/>
         </w:rPr>
-        <w:t>High-Contrast Visual Layout: Navy/emerald color scheme engineered for maximum readability at distances of 5 to 25 meters.</w:t>
+        <w:t>Navy/emerald color scheme engineered for maximum readability at distances of 5 to 25 meters.</w:t>
       </w:r>
     </w:p>
     <w:p>
@@ -918,7 +1118,7 @@
           <w:color w:val="000000"/>
           <w:sz w:val="22"/>
         </w:rPr>
-        <w:t xml:space="preserve">• </w:t>
+        <w:t xml:space="preserve">Counter Status Grid: </w:t>
       </w:r>
       <w:r>
         <w:rPr>
@@ -926,7 +1126,7 @@
           <w:color w:val="000000"/>
           <w:sz w:val="22"/>
         </w:rPr>
-        <w:t>Counter Status Grid: Distinct cards for Counters 1 through 4 displaying active ticket numbers, student names, and purpose of visit.</w:t>
+        <w:t>Distinct cards for Counters 1 through 4 displaying active ticket numbers, student names, and purpose of visit.</w:t>
       </w:r>
     </w:p>
     <w:p>
@@ -941,7 +1141,7 @@
           <w:color w:val="000000"/>
           <w:sz w:val="22"/>
         </w:rPr>
-        <w:t xml:space="preserve">• </w:t>
+        <w:t xml:space="preserve">Flashing Visual Call Alert: </w:t>
       </w:r>
       <w:r>
         <w:rPr>
@@ -949,7 +1149,7 @@
           <w:color w:val="000000"/>
           <w:sz w:val="22"/>
         </w:rPr>
-        <w:t>Flashing Visual Call Alert: Pulses animated border highlights and acoustic attention cues when a new ticket is called or recalled.</w:t>
+        <w:t>Pulses animated border highlights and acoustic attention cues when a new ticket is called or recalled.</w:t>
       </w:r>
     </w:p>
     <w:p>
@@ -964,7 +1164,7 @@
           <w:color w:val="000000"/>
           <w:sz w:val="22"/>
         </w:rPr>
-        <w:t xml:space="preserve">• </w:t>
+        <w:t xml:space="preserve">Live Waiting Ticker: </w:t>
       </w:r>
       <w:r>
         <w:rPr>
@@ -972,7 +1172,7 @@
           <w:color w:val="000000"/>
           <w:sz w:val="22"/>
         </w:rPr>
-        <w:t>Live Waiting Ticker: Right-hand sidebar cycling through upcoming queued tickets, allowing students to track queue progress.</w:t>
+        <w:t>Right-hand sidebar cycling through upcoming queued tickets, allowing students to track queue progress.</w:t>
       </w:r>
     </w:p>
     <w:p>
@@ -1590,7 +1790,7 @@
           <w:color w:val="000000"/>
           <w:sz w:val="22"/>
         </w:rPr>
-        <w:t xml:space="preserve">• </w:t>
+        <w:t xml:space="preserve">Endpoint URL: </w:t>
       </w:r>
       <w:r>
         <w:rPr>
@@ -1598,7 +1798,7 @@
           <w:color w:val="000000"/>
           <w:sz w:val="22"/>
         </w:rPr>
-        <w:t>Endpoint URL: https://app.philsms.com/api/v3/sms/send</w:t>
+        <w:t>https://app.philsms.com/api/v3/sms/send</w:t>
       </w:r>
     </w:p>
     <w:p>
@@ -1613,7 +1813,7 @@
           <w:color w:val="000000"/>
           <w:sz w:val="22"/>
         </w:rPr>
-        <w:t xml:space="preserve">• </w:t>
+        <w:t xml:space="preserve">HTTP Method: </w:t>
       </w:r>
       <w:r>
         <w:rPr>
@@ -1621,7 +1821,7 @@
           <w:color w:val="000000"/>
           <w:sz w:val="22"/>
         </w:rPr>
-        <w:t>HTTP Method: POST</w:t>
+        <w:t>POST</w:t>
       </w:r>
     </w:p>
     <w:p>
@@ -1636,7 +1836,7 @@
           <w:color w:val="000000"/>
           <w:sz w:val="22"/>
         </w:rPr>
-        <w:t xml:space="preserve">• </w:t>
+        <w:t xml:space="preserve">Authentication Header: </w:t>
       </w:r>
       <w:r>
         <w:rPr>
@@ -1644,7 +1844,7 @@
           <w:color w:val="000000"/>
           <w:sz w:val="22"/>
         </w:rPr>
-        <w:t>Authentication Header: Authorization: Bearer &lt;philsms_api_token&gt;</w:t>
+        <w:t>Authorization: Bearer &lt;philsms_api_token&gt;</w:t>
       </w:r>
     </w:p>
     <w:p>
@@ -1659,7 +1859,7 @@
           <w:color w:val="000000"/>
           <w:sz w:val="22"/>
         </w:rPr>
-        <w:t xml:space="preserve">• </w:t>
+        <w:t xml:space="preserve">Request Headers: </w:t>
       </w:r>
       <w:r>
         <w:rPr>
@@ -1667,7 +1867,7 @@
           <w:color w:val="000000"/>
           <w:sz w:val="22"/>
         </w:rPr>
-        <w:t>Request Headers: Content-Type: application/json, Accept: application/json</w:t>
+        <w:t>Content-Type: application/json, Accept: application/json</w:t>
       </w:r>
     </w:p>
     <w:p>
@@ -1682,7 +1882,7 @@
           <w:color w:val="000000"/>
           <w:sz w:val="22"/>
         </w:rPr>
-        <w:t xml:space="preserve">• </w:t>
+        <w:t xml:space="preserve">JSON Request Payload: </w:t>
       </w:r>
       <w:r>
         <w:rPr>
@@ -1690,8 +1890,6 @@
           <w:color w:val="000000"/>
           <w:sz w:val="22"/>
         </w:rPr>
-        <w:t>JSON Request Payload:</w:t>
-        <w:br/>
         <w:t>{</w:t>
         <w:br/>
         <w:t xml:space="preserve">  "recipient": "09171234567",</w:t>
@@ -1717,7 +1915,7 @@
           <w:color w:val="000000"/>
           <w:sz w:val="22"/>
         </w:rPr>
-        <w:t xml:space="preserve">• </w:t>
+        <w:t xml:space="preserve">Response Handling: </w:t>
       </w:r>
       <w:r>
         <w:rPr>
@@ -1725,7 +1923,7 @@
           <w:color w:val="000000"/>
           <w:sz w:val="22"/>
         </w:rPr>
-        <w:t>Response Handling: Parses JSON response status. Success returns code 200 with delivery reference ID; HTTP 4xx/5xx errors are captured in database logs without crashing the host station.</w:t>
+        <w:t>Parses JSON response status. Success returns code 200 with delivery reference ID; HTTP 4xx/5xx errors are captured in database logs without crashing the host station.</w:t>
       </w:r>
     </w:p>
     <w:p>
@@ -2247,7 +2445,7 @@
           <w:color w:val="000000"/>
           <w:sz w:val="22"/>
         </w:rPr>
-        <w:t xml:space="preserve">• </w:t>
+        <w:t xml:space="preserve">Zero Cost &amp; No Internet Requirement: </w:t>
       </w:r>
       <w:r>
         <w:rPr>
@@ -2255,7 +2453,7 @@
           <w:color w:val="000000"/>
           <w:sz w:val="22"/>
         </w:rPr>
-        <w:t>Zero Cost &amp; No Internet Requirement: Dispatches are simulated in-memory and logged to the local SQLite database without contacting PhilSMS servers or consuming prepaid balance.</w:t>
+        <w:t>Dispatches are simulated in-memory and logged to the local SQLite database without contacting PhilSMS servers or consuming prepaid balance.</w:t>
       </w:r>
     </w:p>
     <w:p>
@@ -2270,7 +2468,7 @@
           <w:color w:val="000000"/>
           <w:sz w:val="22"/>
         </w:rPr>
-        <w:t xml:space="preserve">• </w:t>
+        <w:t xml:space="preserve">Terminal Audit Feedback: </w:t>
       </w:r>
       <w:r>
         <w:rPr>
@@ -2278,7 +2476,7 @@
           <w:color w:val="000000"/>
           <w:sz w:val="22"/>
         </w:rPr>
-        <w:t>Terminal Audit Feedback: Dispatches output formatted simulation blocks to stdout:</w:t>
+        <w:t>Dispatches output formatted simulation blocks to stdout:</w:t>
         <w:br/>
         <w:t>[MOCK SMS] To: 09171234567 | Event: CREATED | Msg: 'Hello Juan! Ticket #0001 is confirmed...'</w:t>
       </w:r>
@@ -2295,7 +2493,7 @@
           <w:color w:val="000000"/>
           <w:sz w:val="22"/>
         </w:rPr>
-        <w:t xml:space="preserve">• </w:t>
+        <w:t xml:space="preserve">GUI Log Inspector (SMSLogDialog): </w:t>
       </w:r>
       <w:r>
         <w:rPr>
@@ -2303,7 +2501,7 @@
           <w:color w:val="000000"/>
           <w:sz w:val="22"/>
         </w:rPr>
-        <w:t>GUI Log Inspector (SMSLogDialog): Administrators can review all simulated dispatches in real-time by clicking 'VIEW MOCK SMS LOGS' in Super Admin.</w:t>
+        <w:t>Administrators can review all simulated dispatches in real-time by clicking 'VIEW MOCK SMS LOGS' in Super Admin.</w:t>
       </w:r>
     </w:p>
     <w:p>
@@ -2318,7 +2516,7 @@
           <w:color w:val="000000"/>
           <w:sz w:val="22"/>
         </w:rPr>
-        <w:t xml:space="preserve">• </w:t>
+        <w:t xml:space="preserve">Failsafe Fallback: </w:t>
       </w:r>
       <w:r>
         <w:rPr>
@@ -2326,7 +2524,7 @@
           <w:color w:val="000000"/>
           <w:sz w:val="22"/>
         </w:rPr>
-        <w:t>Failsafe Fallback: If Super Admin is toggled to 'LIVE GATEWAY' but the API Token is empty, the system automatically falls back to Mock Simulation, preventing runtime crashes.</w:t>
+        <w:t>If Super Admin is toggled to 'LIVE GATEWAY' but the API Token is empty, the system automatically falls back to Mock Simulation, preventing runtime crashes.</w:t>
       </w:r>
     </w:p>
     <w:p>
@@ -2375,8 +2573,8 @@
     </w:p>
     <w:p>
       <w:pPr>
-        <w:pStyle w:val="ListBullet"/>
-        <w:spacing w:line="276" w:lineRule="auto" w:before="0" w:after="60"/>
+        <w:spacing w:line="276" w:lineRule="auto" w:before="0" w:after="70"/>
+        <w:ind w:left="504" w:hanging="504"/>
       </w:pPr>
       <w:r>
         <w:rPr>
@@ -2385,7 +2583,17 @@
           <w:color w:val="000000"/>
           <w:sz w:val="22"/>
         </w:rPr>
-        <w:t xml:space="preserve">1. </w:t>
+        <w:t>1.</w:t>
+        <w:tab/>
+      </w:r>
+      <w:r>
+        <w:rPr>
+          <w:rFonts w:ascii="Times New Roman" w:hAnsi="Times New Roman"/>
+          <w:b/>
+          <w:color w:val="000000"/>
+          <w:sz w:val="22"/>
+        </w:rPr>
+        <w:t xml:space="preserve">Project Extraction: </w:t>
       </w:r>
       <w:r>
         <w:rPr>
@@ -2393,13 +2601,13 @@
           <w:color w:val="000000"/>
           <w:sz w:val="22"/>
         </w:rPr>
-        <w:t>Step 1: Clone or extract project bundle to target directory (/home/javvii/FreelanceProject/Project6).</w:t>
+        <w:t>Clone or extract project bundle to target directory (/home/javvii/FreelanceProject/Project6).</w:t>
       </w:r>
     </w:p>
     <w:p>
       <w:pPr>
-        <w:pStyle w:val="ListBullet"/>
-        <w:spacing w:line="276" w:lineRule="auto" w:before="0" w:after="60"/>
+        <w:spacing w:line="276" w:lineRule="auto" w:before="0" w:after="70"/>
+        <w:ind w:left="504" w:hanging="504"/>
       </w:pPr>
       <w:r>
         <w:rPr>
@@ -2408,7 +2616,17 @@
           <w:color w:val="000000"/>
           <w:sz w:val="22"/>
         </w:rPr>
-        <w:t xml:space="preserve">2. </w:t>
+        <w:t>2.</w:t>
+        <w:tab/>
+      </w:r>
+      <w:r>
+        <w:rPr>
+          <w:rFonts w:ascii="Times New Roman" w:hAnsi="Times New Roman"/>
+          <w:b/>
+          <w:color w:val="000000"/>
+          <w:sz w:val="22"/>
+        </w:rPr>
+        <w:t xml:space="preserve">Virtual Environment: </w:t>
       </w:r>
       <w:r>
         <w:rPr>
@@ -2416,13 +2634,13 @@
           <w:color w:val="000000"/>
           <w:sz w:val="22"/>
         </w:rPr>
-        <w:t>Step 2: Initialize virtual environment: python3 -m venv .venv</w:t>
+        <w:t>Initialize virtual environment: python3 -m venv .venv</w:t>
       </w:r>
     </w:p>
     <w:p>
       <w:pPr>
-        <w:pStyle w:val="ListBullet"/>
-        <w:spacing w:line="276" w:lineRule="auto" w:before="0" w:after="60"/>
+        <w:spacing w:line="276" w:lineRule="auto" w:before="0" w:after="70"/>
+        <w:ind w:left="504" w:hanging="504"/>
       </w:pPr>
       <w:r>
         <w:rPr>
@@ -2431,7 +2649,17 @@
           <w:color w:val="000000"/>
           <w:sz w:val="22"/>
         </w:rPr>
-        <w:t xml:space="preserve">3. </w:t>
+        <w:t>3.</w:t>
+        <w:tab/>
+      </w:r>
+      <w:r>
+        <w:rPr>
+          <w:rFonts w:ascii="Times New Roman" w:hAnsi="Times New Roman"/>
+          <w:b/>
+          <w:color w:val="000000"/>
+          <w:sz w:val="22"/>
+        </w:rPr>
+        <w:t xml:space="preserve">Environment Activation: </w:t>
       </w:r>
       <w:r>
         <w:rPr>
@@ -2439,17 +2667,13 @@
           <w:color w:val="000000"/>
           <w:sz w:val="22"/>
         </w:rPr>
-        <w:t>Step 3: Activate virtual environment:</w:t>
-        <w:br/>
-        <w:t>• Linux: source .venv/bin/activate</w:t>
-        <w:br/>
-        <w:t>• Windows: .venv\Scripts\activate</w:t>
+        <w:t>Linux: source .venv/bin/activate | Windows: .venv\Scripts\activate</w:t>
       </w:r>
     </w:p>
     <w:p>
       <w:pPr>
-        <w:pStyle w:val="ListBullet"/>
-        <w:spacing w:line="276" w:lineRule="auto" w:before="0" w:after="60"/>
+        <w:spacing w:line="276" w:lineRule="auto" w:before="0" w:after="70"/>
+        <w:ind w:left="504" w:hanging="504"/>
       </w:pPr>
       <w:r>
         <w:rPr>
@@ -2458,7 +2682,17 @@
           <w:color w:val="000000"/>
           <w:sz w:val="22"/>
         </w:rPr>
-        <w:t xml:space="preserve">4. </w:t>
+        <w:t>4.</w:t>
+        <w:tab/>
+      </w:r>
+      <w:r>
+        <w:rPr>
+          <w:rFonts w:ascii="Times New Roman" w:hAnsi="Times New Roman"/>
+          <w:b/>
+          <w:color w:val="000000"/>
+          <w:sz w:val="22"/>
+        </w:rPr>
+        <w:t xml:space="preserve">Package Installation: </w:t>
       </w:r>
       <w:r>
         <w:rPr>
@@ -2466,7 +2700,7 @@
           <w:color w:val="000000"/>
           <w:sz w:val="22"/>
         </w:rPr>
-        <w:t>Step 4: Install dependencies: pip install -r requirements.txt</w:t>
+        <w:t>Install dependencies: pip install -r requirements.txt</w:t>
       </w:r>
     </w:p>
     <w:p>
@@ -5041,7 +5275,7 @@
           <w:color w:val="000000"/>
           <w:sz w:val="22"/>
         </w:rPr>
-        <w:t xml:space="preserve">• </w:t>
+        <w:t xml:space="preserve">sms_enabled: </w:t>
       </w:r>
       <w:r>
         <w:rPr>
@@ -5049,7 +5283,7 @@
           <w:color w:val="000000"/>
           <w:sz w:val="22"/>
         </w:rPr>
-        <w:t>sms_enabled: '1' (active) or '0' (disabled).</w:t>
+        <w:t>'1' (active) or '0' (disabled).</w:t>
       </w:r>
     </w:p>
     <w:p>
@@ -5064,7 +5298,7 @@
           <w:color w:val="000000"/>
           <w:sz w:val="22"/>
         </w:rPr>
-        <w:t xml:space="preserve">• </w:t>
+        <w:t xml:space="preserve">sms_mock_mode: </w:t>
       </w:r>
       <w:r>
         <w:rPr>
@@ -5072,7 +5306,7 @@
           <w:color w:val="000000"/>
           <w:sz w:val="22"/>
         </w:rPr>
-        <w:t>sms_mock_mode: '1' (local mock simulation) or '0' (live PhilSMS API dispatches).</w:t>
+        <w:t>'1' (local mock simulation) or '0' (live PhilSMS API dispatches).</w:t>
       </w:r>
     </w:p>
     <w:p>
@@ -5087,7 +5321,7 @@
           <w:color w:val="000000"/>
           <w:sz w:val="22"/>
         </w:rPr>
-        <w:t xml:space="preserve">• </w:t>
+        <w:t xml:space="preserve">sms_gateway_url: </w:t>
       </w:r>
       <w:r>
         <w:rPr>
@@ -5095,7 +5329,7 @@
           <w:color w:val="000000"/>
           <w:sz w:val="22"/>
         </w:rPr>
-        <w:t>sms_gateway_url: URL for PhilSMS endpoint (default: https://app.philsms.com/api/v3/sms/send).</w:t>
+        <w:t>URL for PhilSMS endpoint (default: https://app.philsms.com/api/v3/sms/send).</w:t>
       </w:r>
     </w:p>
     <w:p>
@@ -5110,7 +5344,7 @@
           <w:color w:val="000000"/>
           <w:sz w:val="22"/>
         </w:rPr>
-        <w:t xml:space="preserve">• </w:t>
+        <w:t xml:space="preserve">sms_api_key: </w:t>
       </w:r>
       <w:r>
         <w:rPr>
@@ -5118,7 +5352,7 @@
           <w:color w:val="000000"/>
           <w:sz w:val="22"/>
         </w:rPr>
-        <w:t>sms_api_key: PhilSMS API Bearer Token.</w:t>
+        <w:t>PhilSMS API Bearer Token.</w:t>
       </w:r>
     </w:p>
     <w:p>
@@ -5133,7 +5367,7 @@
           <w:color w:val="000000"/>
           <w:sz w:val="22"/>
         </w:rPr>
-        <w:t xml:space="preserve">• </w:t>
+        <w:t xml:space="preserve">sms_sender_name: </w:t>
       </w:r>
       <w:r>
         <w:rPr>
@@ -5141,7 +5375,7 @@
           <w:color w:val="000000"/>
           <w:sz w:val="22"/>
         </w:rPr>
-        <w:t>sms_sender_name: Registered Sender ID (e.g. 'PhilSMS' or 'TapNQue').</w:t>
+        <w:t>Registered Sender ID (e.g. 'PhilSMS' or 'TapNQue').</w:t>
       </w:r>
     </w:p>
     <w:p>
@@ -5156,7 +5390,7 @@
           <w:color w:val="000000"/>
           <w:sz w:val="22"/>
         </w:rPr>
-        <w:t xml:space="preserve">• </w:t>
+        <w:t xml:space="preserve">sms_completed_enabled: </w:t>
       </w:r>
       <w:r>
         <w:rPr>
@@ -5164,7 +5398,7 @@
           <w:color w:val="000000"/>
           <w:sz w:val="22"/>
         </w:rPr>
-        <w:t>sms_completed_enabled: '1' (dispatch completed SMS) or '0' (suppress completion SMS).</w:t>
+        <w:t>'1' (dispatch completed SMS) or '0' (suppress completion SMS).</w:t>
       </w:r>
     </w:p>
     <w:p>
@@ -5179,7 +5413,7 @@
           <w:color w:val="000000"/>
           <w:sz w:val="22"/>
         </w:rPr>
-        <w:t xml:space="preserve">• </w:t>
+        <w:t xml:space="preserve">phone_number_enabled: </w:t>
       </w:r>
       <w:r>
         <w:rPr>
@@ -5187,7 +5421,7 @@
           <w:color w:val="000000"/>
           <w:sz w:val="22"/>
         </w:rPr>
-        <w:t>phone_number_enabled: '1' (show phone field on Kiosk) or '0' (hide phone field).</w:t>
+        <w:t>'1' (show phone field on Kiosk) or '0' (hide phone field).</w:t>
       </w:r>
     </w:p>
     <w:p>
@@ -5202,7 +5436,7 @@
           <w:color w:val="000000"/>
           <w:sz w:val="22"/>
         </w:rPr>
-        <w:t xml:space="preserve">• </w:t>
+        <w:t xml:space="preserve">sms_template_created / sms_template_called / sms_template_completed: </w:t>
       </w:r>
       <w:r>
         <w:rPr>
@@ -5210,7 +5444,7 @@
           <w:color w:val="000000"/>
           <w:sz w:val="22"/>
         </w:rPr>
-        <w:t>sms_template_created / sms_template_called / sms_template_completed: Custom notification message strings.</w:t>
+        <w:t>Custom notification message strings.</w:t>
       </w:r>
     </w:p>
     <w:sectPr>

</xml_diff>

<commit_message>
docs(guide): add comprehensive PhilSMS setup guide to PhilSMS manual
</commit_message>
<xml_diff>
--- a/docs/11-09-2026_TapNQue_Comprehensive_System_Guide_and_PhilSMS_Manual.docx
+++ b/docs/11-09-2026_TapNQue_Comprehensive_System_Guide_and_PhilSMS_Manual.docx
@@ -99,7 +99,7 @@
     <w:p>
       <w:pPr>
         <w:keepNext/>
-        <w:spacing w:before="260" w:after="80"/>
+        <w:spacing w:before="280" w:after="80"/>
       </w:pPr>
       <w:r>
         <w:rPr>
@@ -295,7 +295,7 @@
     <w:p>
       <w:pPr>
         <w:keepNext/>
-        <w:spacing w:before="260" w:after="80"/>
+        <w:spacing w:before="280" w:after="80"/>
       </w:pPr>
       <w:r>
         <w:rPr>
@@ -1178,7 +1178,7 @@
     <w:p>
       <w:pPr>
         <w:keepNext/>
-        <w:spacing w:before="260" w:after="80"/>
+        <w:spacing w:before="280" w:after="80"/>
       </w:pPr>
       <w:r>
         <w:rPr>
@@ -1723,7 +1723,7 @@
     <w:p>
       <w:pPr>
         <w:keepNext/>
-        <w:spacing w:before="260" w:after="80"/>
+        <w:spacing w:before="280" w:after="80"/>
       </w:pPr>
       <w:r>
         <w:rPr>
@@ -2407,7 +2407,7 @@
     <w:p>
       <w:pPr>
         <w:keepNext/>
-        <w:spacing w:before="260" w:after="80"/>
+        <w:spacing w:before="280" w:after="80"/>
       </w:pPr>
       <w:r>
         <w:rPr>
@@ -2416,7 +2416,1676 @@
           <w:color w:val="000000"/>
           <w:sz w:val="26"/>
         </w:rPr>
-        <w:t>5. Safe Capstone Mock Simulation Mode</w:t>
+        <w:t>5. Step-by-Step PhilSMS Account Setup &amp; Gateway Configuration Guide</w:t>
+      </w:r>
+    </w:p>
+    <w:p>
+      <w:pPr>
+        <w:spacing w:line="276" w:lineRule="auto" w:before="0" w:after="90"/>
+      </w:pPr>
+      <w:r>
+        <w:rPr>
+          <w:rFonts w:ascii="Times New Roman" w:hAnsi="Times New Roman"/>
+          <w:i w:val="0"/>
+          <w:color w:val="000000"/>
+          <w:sz w:val="22"/>
+        </w:rPr>
+        <w:t>This section outlines the complete, end-to-end setup procedure for registering a PhilSMS cloud account, provisioning API access tokens, securing SMS credits, configuring the TapNQue gateway, and executing live test dispatches.</w:t>
+      </w:r>
+    </w:p>
+    <w:p>
+      <w:pPr>
+        <w:keepNext/>
+        <w:spacing w:before="180" w:after="60"/>
+      </w:pPr>
+      <w:r>
+        <w:rPr>
+          <w:rFonts w:ascii="Times New Roman" w:hAnsi="Times New Roman"/>
+          <w:b/>
+          <w:color w:val="000000"/>
+          <w:sz w:val="23"/>
+        </w:rPr>
+        <w:t>5.1 Account Registration &amp; Portal Onboarding</w:t>
+      </w:r>
+    </w:p>
+    <w:p>
+      <w:pPr>
+        <w:spacing w:line="276" w:lineRule="auto" w:before="0" w:after="70"/>
+        <w:ind w:left="504" w:hanging="504"/>
+      </w:pPr>
+      <w:r>
+        <w:rPr>
+          <w:rFonts w:ascii="Times New Roman" w:hAnsi="Times New Roman"/>
+          <w:b/>
+          <w:color w:val="000000"/>
+          <w:sz w:val="22"/>
+        </w:rPr>
+        <w:t>1.</w:t>
+        <w:tab/>
+      </w:r>
+      <w:r>
+        <w:rPr>
+          <w:rFonts w:ascii="Times New Roman" w:hAnsi="Times New Roman"/>
+          <w:b/>
+          <w:color w:val="000000"/>
+          <w:sz w:val="22"/>
+        </w:rPr>
+        <w:t xml:space="preserve">Access Portal: </w:t>
+      </w:r>
+      <w:r>
+        <w:rPr>
+          <w:rFonts w:ascii="Times New Roman" w:hAnsi="Times New Roman"/>
+          <w:color w:val="000000"/>
+          <w:sz w:val="22"/>
+        </w:rPr>
+        <w:t>Open an internet browser and navigate to the official portal at https://app.philsms.com/.</w:t>
+      </w:r>
+    </w:p>
+    <w:p>
+      <w:pPr>
+        <w:spacing w:line="276" w:lineRule="auto" w:before="0" w:after="70"/>
+        <w:ind w:left="504" w:hanging="504"/>
+      </w:pPr>
+      <w:r>
+        <w:rPr>
+          <w:rFonts w:ascii="Times New Roman" w:hAnsi="Times New Roman"/>
+          <w:b/>
+          <w:color w:val="000000"/>
+          <w:sz w:val="22"/>
+        </w:rPr>
+        <w:t>2.</w:t>
+        <w:tab/>
+      </w:r>
+      <w:r>
+        <w:rPr>
+          <w:rFonts w:ascii="Times New Roman" w:hAnsi="Times New Roman"/>
+          <w:b/>
+          <w:color w:val="000000"/>
+          <w:sz w:val="22"/>
+        </w:rPr>
+        <w:t xml:space="preserve">Create Account: </w:t>
+      </w:r>
+      <w:r>
+        <w:rPr>
+          <w:rFonts w:ascii="Times New Roman" w:hAnsi="Times New Roman"/>
+          <w:color w:val="000000"/>
+          <w:sz w:val="22"/>
+        </w:rPr>
+        <w:t>Click Register / Sign Up and complete the registration form using your institution, department, or project email address.</w:t>
+      </w:r>
+    </w:p>
+    <w:p>
+      <w:pPr>
+        <w:spacing w:line="276" w:lineRule="auto" w:before="0" w:after="70"/>
+        <w:ind w:left="504" w:hanging="504"/>
+      </w:pPr>
+      <w:r>
+        <w:rPr>
+          <w:rFonts w:ascii="Times New Roman" w:hAnsi="Times New Roman"/>
+          <w:b/>
+          <w:color w:val="000000"/>
+          <w:sz w:val="22"/>
+        </w:rPr>
+        <w:t>3.</w:t>
+        <w:tab/>
+      </w:r>
+      <w:r>
+        <w:rPr>
+          <w:rFonts w:ascii="Times New Roman" w:hAnsi="Times New Roman"/>
+          <w:b/>
+          <w:color w:val="000000"/>
+          <w:sz w:val="22"/>
+        </w:rPr>
+        <w:t xml:space="preserve">Email Verification: </w:t>
+      </w:r>
+      <w:r>
+        <w:rPr>
+          <w:rFonts w:ascii="Times New Roman" w:hAnsi="Times New Roman"/>
+          <w:color w:val="000000"/>
+          <w:sz w:val="22"/>
+        </w:rPr>
+        <w:t>Check your email inbox and click the verification link sent by the PhilSMS automated activation system.</w:t>
+      </w:r>
+    </w:p>
+    <w:p>
+      <w:pPr>
+        <w:spacing w:line="276" w:lineRule="auto" w:before="0" w:after="70"/>
+        <w:ind w:left="504" w:hanging="504"/>
+      </w:pPr>
+      <w:r>
+        <w:rPr>
+          <w:rFonts w:ascii="Times New Roman" w:hAnsi="Times New Roman"/>
+          <w:b/>
+          <w:color w:val="000000"/>
+          <w:sz w:val="22"/>
+        </w:rPr>
+        <w:t>4.</w:t>
+        <w:tab/>
+      </w:r>
+      <w:r>
+        <w:rPr>
+          <w:rFonts w:ascii="Times New Roman" w:hAnsi="Times New Roman"/>
+          <w:b/>
+          <w:color w:val="000000"/>
+          <w:sz w:val="22"/>
+        </w:rPr>
+        <w:t xml:space="preserve">Dashboard Login: </w:t>
+      </w:r>
+      <w:r>
+        <w:rPr>
+          <w:rFonts w:ascii="Times New Roman" w:hAnsi="Times New Roman"/>
+          <w:color w:val="000000"/>
+          <w:sz w:val="22"/>
+        </w:rPr>
+        <w:t>Log in to the PhilSMS dashboard at https://app.philsms.com/login to confirm your account status.</w:t>
+      </w:r>
+    </w:p>
+    <w:p>
+      <w:pPr>
+        <w:keepNext/>
+        <w:spacing w:before="180" w:after="60"/>
+      </w:pPr>
+      <w:r>
+        <w:rPr>
+          <w:rFonts w:ascii="Times New Roman" w:hAnsi="Times New Roman"/>
+          <w:b/>
+          <w:color w:val="000000"/>
+          <w:sz w:val="23"/>
+        </w:rPr>
+        <w:t>5.2 Generating API Access Tokens (Bearer Key)</w:t>
+      </w:r>
+    </w:p>
+    <w:p>
+      <w:pPr>
+        <w:spacing w:line="276" w:lineRule="auto" w:before="0" w:after="70"/>
+        <w:ind w:left="504" w:hanging="504"/>
+      </w:pPr>
+      <w:r>
+        <w:rPr>
+          <w:rFonts w:ascii="Times New Roman" w:hAnsi="Times New Roman"/>
+          <w:b/>
+          <w:color w:val="000000"/>
+          <w:sz w:val="22"/>
+        </w:rPr>
+        <w:t>1.</w:t>
+        <w:tab/>
+      </w:r>
+      <w:r>
+        <w:rPr>
+          <w:rFonts w:ascii="Times New Roman" w:hAnsi="Times New Roman"/>
+          <w:b/>
+          <w:color w:val="000000"/>
+          <w:sz w:val="22"/>
+        </w:rPr>
+        <w:t xml:space="preserve">Navigate to API Settings: </w:t>
+      </w:r>
+      <w:r>
+        <w:rPr>
+          <w:rFonts w:ascii="Times New Roman" w:hAnsi="Times New Roman"/>
+          <w:color w:val="000000"/>
+          <w:sz w:val="22"/>
+        </w:rPr>
+        <w:t>In the left-hand navigation sidebar of the PhilSMS dashboard, select Developers (or API Settings) &gt; API Access Tokens.</w:t>
+      </w:r>
+    </w:p>
+    <w:p>
+      <w:pPr>
+        <w:spacing w:line="276" w:lineRule="auto" w:before="0" w:after="70"/>
+        <w:ind w:left="504" w:hanging="504"/>
+      </w:pPr>
+      <w:r>
+        <w:rPr>
+          <w:rFonts w:ascii="Times New Roman" w:hAnsi="Times New Roman"/>
+          <w:b/>
+          <w:color w:val="000000"/>
+          <w:sz w:val="22"/>
+        </w:rPr>
+        <w:t>2.</w:t>
+        <w:tab/>
+      </w:r>
+      <w:r>
+        <w:rPr>
+          <w:rFonts w:ascii="Times New Roman" w:hAnsi="Times New Roman"/>
+          <w:b/>
+          <w:color w:val="000000"/>
+          <w:sz w:val="22"/>
+        </w:rPr>
+        <w:t xml:space="preserve">Generate New Token: </w:t>
+      </w:r>
+      <w:r>
+        <w:rPr>
+          <w:rFonts w:ascii="Times New Roman" w:hAnsi="Times New Roman"/>
+          <w:color w:val="000000"/>
+          <w:sz w:val="22"/>
+        </w:rPr>
+        <w:t>Click the Generate New Token (or Create API Key) button.</w:t>
+      </w:r>
+    </w:p>
+    <w:p>
+      <w:pPr>
+        <w:spacing w:line="276" w:lineRule="auto" w:before="0" w:after="70"/>
+        <w:ind w:left="504" w:hanging="504"/>
+      </w:pPr>
+      <w:r>
+        <w:rPr>
+          <w:rFonts w:ascii="Times New Roman" w:hAnsi="Times New Roman"/>
+          <w:b/>
+          <w:color w:val="000000"/>
+          <w:sz w:val="22"/>
+        </w:rPr>
+        <w:t>3.</w:t>
+        <w:tab/>
+      </w:r>
+      <w:r>
+        <w:rPr>
+          <w:rFonts w:ascii="Times New Roman" w:hAnsi="Times New Roman"/>
+          <w:b/>
+          <w:color w:val="000000"/>
+          <w:sz w:val="22"/>
+        </w:rPr>
+        <w:t xml:space="preserve">Label Token: </w:t>
+      </w:r>
+      <w:r>
+        <w:rPr>
+          <w:rFonts w:ascii="Times New Roman" w:hAnsi="Times New Roman"/>
+          <w:color w:val="000000"/>
+          <w:sz w:val="22"/>
+        </w:rPr>
+        <w:t>Assign a clear, descriptive label for the token (e.g. 'TapNQue Campus Queue Terminals').</w:t>
+      </w:r>
+    </w:p>
+    <w:p>
+      <w:pPr>
+        <w:spacing w:line="276" w:lineRule="auto" w:before="0" w:after="70"/>
+        <w:ind w:left="504" w:hanging="504"/>
+      </w:pPr>
+      <w:r>
+        <w:rPr>
+          <w:rFonts w:ascii="Times New Roman" w:hAnsi="Times New Roman"/>
+          <w:b/>
+          <w:color w:val="000000"/>
+          <w:sz w:val="22"/>
+        </w:rPr>
+        <w:t>4.</w:t>
+        <w:tab/>
+      </w:r>
+      <w:r>
+        <w:rPr>
+          <w:rFonts w:ascii="Times New Roman" w:hAnsi="Times New Roman"/>
+          <w:b/>
+          <w:color w:val="000000"/>
+          <w:sz w:val="22"/>
+        </w:rPr>
+        <w:t xml:space="preserve">Copy Secret Bearer Key: </w:t>
+      </w:r>
+      <w:r>
+        <w:rPr>
+          <w:rFonts w:ascii="Times New Roman" w:hAnsi="Times New Roman"/>
+          <w:color w:val="000000"/>
+          <w:sz w:val="22"/>
+        </w:rPr>
+        <w:t>Copy the generated hexadecimal Bearer token immediately. For security reasons, the full token is displayed only once.</w:t>
+      </w:r>
+    </w:p>
+    <w:p>
+      <w:pPr>
+        <w:spacing w:line="276" w:lineRule="auto" w:before="0" w:after="70"/>
+        <w:ind w:left="504" w:hanging="504"/>
+      </w:pPr>
+      <w:r>
+        <w:rPr>
+          <w:rFonts w:ascii="Times New Roman" w:hAnsi="Times New Roman"/>
+          <w:b/>
+          <w:color w:val="000000"/>
+          <w:sz w:val="22"/>
+        </w:rPr>
+        <w:t>5.</w:t>
+        <w:tab/>
+      </w:r>
+      <w:r>
+        <w:rPr>
+          <w:rFonts w:ascii="Times New Roman" w:hAnsi="Times New Roman"/>
+          <w:b/>
+          <w:color w:val="000000"/>
+          <w:sz w:val="22"/>
+        </w:rPr>
+        <w:t xml:space="preserve">Security Recommendation: </w:t>
+      </w:r>
+      <w:r>
+        <w:rPr>
+          <w:rFonts w:ascii="Times New Roman" w:hAnsi="Times New Roman"/>
+          <w:color w:val="000000"/>
+          <w:sz w:val="22"/>
+        </w:rPr>
+        <w:t>Store this key in a secure location. Never commit production API keys to public repositories or unencrypted external drives.</w:t>
+      </w:r>
+    </w:p>
+    <w:p>
+      <w:pPr>
+        <w:keepNext/>
+        <w:spacing w:before="180" w:after="60"/>
+      </w:pPr>
+      <w:r>
+        <w:rPr>
+          <w:rFonts w:ascii="Times New Roman" w:hAnsi="Times New Roman"/>
+          <w:b/>
+          <w:color w:val="000000"/>
+          <w:sz w:val="23"/>
+        </w:rPr>
+        <w:t>5.3 Sender ID Selection &amp; Provisioning</w:t>
+      </w:r>
+    </w:p>
+    <w:p>
+      <w:pPr>
+        <w:spacing w:line="276" w:lineRule="auto" w:before="0" w:after="70"/>
+        <w:ind w:left="504" w:hanging="504"/>
+      </w:pPr>
+      <w:r>
+        <w:rPr>
+          <w:rFonts w:ascii="Times New Roman" w:hAnsi="Times New Roman"/>
+          <w:b/>
+          <w:color w:val="000000"/>
+          <w:sz w:val="22"/>
+        </w:rPr>
+        <w:t>1.</w:t>
+        <w:tab/>
+      </w:r>
+      <w:r>
+        <w:rPr>
+          <w:rFonts w:ascii="Times New Roman" w:hAnsi="Times New Roman"/>
+          <w:b/>
+          <w:color w:val="000000"/>
+          <w:sz w:val="22"/>
+        </w:rPr>
+        <w:t xml:space="preserve">Default Pre-Approved Sender ID ('PhilSMS'): </w:t>
+      </w:r>
+      <w:r>
+        <w:rPr>
+          <w:rFonts w:ascii="Times New Roman" w:hAnsi="Times New Roman"/>
+          <w:color w:val="000000"/>
+          <w:sz w:val="22"/>
+        </w:rPr>
+        <w:t>Every PhilSMS account includes the default pre-approved sender ID 'PhilSMS'. This ID requires no carrier review, no business documents, and is immediately active for instant dispatches.</w:t>
+      </w:r>
+    </w:p>
+    <w:p>
+      <w:pPr>
+        <w:spacing w:line="276" w:lineRule="auto" w:before="0" w:after="70"/>
+        <w:ind w:left="504" w:hanging="504"/>
+      </w:pPr>
+      <w:r>
+        <w:rPr>
+          <w:rFonts w:ascii="Times New Roman" w:hAnsi="Times New Roman"/>
+          <w:b/>
+          <w:color w:val="000000"/>
+          <w:sz w:val="22"/>
+        </w:rPr>
+        <w:t>2.</w:t>
+        <w:tab/>
+      </w:r>
+      <w:r>
+        <w:rPr>
+          <w:rFonts w:ascii="Times New Roman" w:hAnsi="Times New Roman"/>
+          <w:b/>
+          <w:color w:val="000000"/>
+          <w:sz w:val="22"/>
+        </w:rPr>
+        <w:t xml:space="preserve">Custom Institutional Sender ID (Optional): </w:t>
+      </w:r>
+      <w:r>
+        <w:rPr>
+          <w:rFonts w:ascii="Times New Roman" w:hAnsi="Times New Roman"/>
+          <w:color w:val="000000"/>
+          <w:sz w:val="22"/>
+        </w:rPr>
+        <w:t>If your institution requires a personalized brand (e.g., 'TapNQue' or 'OLFU'), navigate to Sender IDs &gt; Request Sender ID in the dashboard. Submit the required institutional documentation (Dean endorsement or school registration). Telco network approval typically requires 3 to 7 business days across Smart, Globe, and Dito.</w:t>
+      </w:r>
+    </w:p>
+    <w:p>
+      <w:pPr>
+        <w:keepNext/>
+        <w:spacing w:before="180" w:after="60"/>
+      </w:pPr>
+      <w:r>
+        <w:rPr>
+          <w:rFonts w:ascii="Times New Roman" w:hAnsi="Times New Roman"/>
+          <w:b/>
+          <w:color w:val="000000"/>
+          <w:sz w:val="23"/>
+        </w:rPr>
+        <w:t>5.4 SMS Credit Top-Up &amp; Pricing Overview</w:t>
+      </w:r>
+    </w:p>
+    <w:p>
+      <w:pPr>
+        <w:spacing w:line="276" w:lineRule="auto" w:before="0" w:after="70"/>
+        <w:ind w:left="504" w:hanging="504"/>
+      </w:pPr>
+      <w:r>
+        <w:rPr>
+          <w:rFonts w:ascii="Times New Roman" w:hAnsi="Times New Roman"/>
+          <w:b/>
+          <w:color w:val="000000"/>
+          <w:sz w:val="22"/>
+        </w:rPr>
+        <w:t>1.</w:t>
+        <w:tab/>
+      </w:r>
+      <w:r>
+        <w:rPr>
+          <w:rFonts w:ascii="Times New Roman" w:hAnsi="Times New Roman"/>
+          <w:b/>
+          <w:color w:val="000000"/>
+          <w:sz w:val="22"/>
+        </w:rPr>
+        <w:t xml:space="preserve">Unit Cost Efficiency: </w:t>
+      </w:r>
+      <w:r>
+        <w:rPr>
+          <w:rFonts w:ascii="Times New Roman" w:hAnsi="Times New Roman"/>
+          <w:color w:val="000000"/>
+          <w:sz w:val="22"/>
+        </w:rPr>
+        <w:t>PhilSMS charges approximately ₱0.35 to ₱0.40 per 160-character standard SMS segment, yielding approximately 30% savings compared to legacy gateways.</w:t>
+      </w:r>
+    </w:p>
+    <w:p>
+      <w:pPr>
+        <w:spacing w:line="276" w:lineRule="auto" w:before="0" w:after="70"/>
+        <w:ind w:left="504" w:hanging="504"/>
+      </w:pPr>
+      <w:r>
+        <w:rPr>
+          <w:rFonts w:ascii="Times New Roman" w:hAnsi="Times New Roman"/>
+          <w:b/>
+          <w:color w:val="000000"/>
+          <w:sz w:val="22"/>
+        </w:rPr>
+        <w:t>2.</w:t>
+        <w:tab/>
+      </w:r>
+      <w:r>
+        <w:rPr>
+          <w:rFonts w:ascii="Times New Roman" w:hAnsi="Times New Roman"/>
+          <w:b/>
+          <w:color w:val="000000"/>
+          <w:sz w:val="22"/>
+        </w:rPr>
+        <w:t xml:space="preserve">Zero Minimum Barrier: </w:t>
+      </w:r>
+      <w:r>
+        <w:rPr>
+          <w:rFonts w:ascii="Times New Roman" w:hAnsi="Times New Roman"/>
+          <w:color w:val="000000"/>
+          <w:sz w:val="22"/>
+        </w:rPr>
+        <w:t>Unlike traditional SMS platforms that impose a strict ₱500 to ₱1,000 minimum reload lock-in, PhilSMS allows micro top-ups as low as ₱50 or ₱100, ideal for capstone evaluations.</w:t>
+      </w:r>
+    </w:p>
+    <w:p>
+      <w:pPr>
+        <w:spacing w:line="276" w:lineRule="auto" w:before="0" w:after="70"/>
+        <w:ind w:left="504" w:hanging="504"/>
+      </w:pPr>
+      <w:r>
+        <w:rPr>
+          <w:rFonts w:ascii="Times New Roman" w:hAnsi="Times New Roman"/>
+          <w:b/>
+          <w:color w:val="000000"/>
+          <w:sz w:val="22"/>
+        </w:rPr>
+        <w:t>3.</w:t>
+        <w:tab/>
+      </w:r>
+      <w:r>
+        <w:rPr>
+          <w:rFonts w:ascii="Times New Roman" w:hAnsi="Times New Roman"/>
+          <w:b/>
+          <w:color w:val="000000"/>
+          <w:sz w:val="22"/>
+        </w:rPr>
+        <w:t xml:space="preserve">Flexible Payment Gateways: </w:t>
+      </w:r>
+      <w:r>
+        <w:rPr>
+          <w:rFonts w:ascii="Times New Roman" w:hAnsi="Times New Roman"/>
+          <w:color w:val="000000"/>
+          <w:sz w:val="22"/>
+        </w:rPr>
+        <w:t>Credits can be purchased directly in the portal using GCash, Maya, ShopeePay, Dragonpay, or Philippine online banking (BDO, BPI, UnionBank).</w:t>
+      </w:r>
+    </w:p>
+    <w:p>
+      <w:pPr>
+        <w:spacing w:line="276" w:lineRule="auto" w:before="0" w:after="70"/>
+        <w:ind w:left="504" w:hanging="504"/>
+      </w:pPr>
+      <w:r>
+        <w:rPr>
+          <w:rFonts w:ascii="Times New Roman" w:hAnsi="Times New Roman"/>
+          <w:b/>
+          <w:color w:val="000000"/>
+          <w:sz w:val="22"/>
+        </w:rPr>
+        <w:t>4.</w:t>
+        <w:tab/>
+      </w:r>
+      <w:r>
+        <w:rPr>
+          <w:rFonts w:ascii="Times New Roman" w:hAnsi="Times New Roman"/>
+          <w:b/>
+          <w:color w:val="000000"/>
+          <w:sz w:val="22"/>
+        </w:rPr>
+        <w:t xml:space="preserve">Permanent Credit Validity: </w:t>
+      </w:r>
+      <w:r>
+        <w:rPr>
+          <w:rFonts w:ascii="Times New Roman" w:hAnsi="Times New Roman"/>
+          <w:color w:val="000000"/>
+          <w:sz w:val="22"/>
+        </w:rPr>
+        <w:t>Purchased SMS credits never expire, enabling multi-semester deployments without balance forfeiture.</w:t>
+      </w:r>
+    </w:p>
+    <w:p>
+      <w:pPr>
+        <w:keepNext/>
+        <w:spacing w:before="180" w:after="60"/>
+      </w:pPr>
+      <w:r>
+        <w:rPr>
+          <w:rFonts w:ascii="Times New Roman" w:hAnsi="Times New Roman"/>
+          <w:b/>
+          <w:color w:val="000000"/>
+          <w:sz w:val="23"/>
+        </w:rPr>
+        <w:t>5.5 Configuring TapNQue for PhilSMS Integration</w:t>
+      </w:r>
+    </w:p>
+    <w:p>
+      <w:pPr>
+        <w:spacing w:line="276" w:lineRule="auto" w:before="0" w:after="90"/>
+      </w:pPr>
+      <w:r>
+        <w:rPr>
+          <w:rFonts w:ascii="Times New Roman" w:hAnsi="Times New Roman"/>
+          <w:i w:val="0"/>
+          <w:color w:val="000000"/>
+          <w:sz w:val="22"/>
+        </w:rPr>
+        <w:t>TapNQue provides two convenient methods for configuring the PhilSMS gateway credentials:</w:t>
+      </w:r>
+    </w:p>
+    <w:p>
+      <w:pPr>
+        <w:keepNext/>
+        <w:spacing w:before="140" w:after="40"/>
+      </w:pPr>
+      <w:r>
+        <w:rPr>
+          <w:rFonts w:ascii="Times New Roman" w:hAnsi="Times New Roman"/>
+          <w:b/>
+          <w:i/>
+          <w:color w:val="000000"/>
+          <w:sz w:val="22"/>
+        </w:rPr>
+        <w:t>Method A: Graphical Configuration via Super Admin Console (Recommended)</w:t>
+      </w:r>
+    </w:p>
+    <w:p>
+      <w:pPr>
+        <w:spacing w:line="276" w:lineRule="auto" w:before="0" w:after="70"/>
+        <w:ind w:left="504" w:hanging="504"/>
+      </w:pPr>
+      <w:r>
+        <w:rPr>
+          <w:rFonts w:ascii="Times New Roman" w:hAnsi="Times New Roman"/>
+          <w:b/>
+          <w:color w:val="000000"/>
+          <w:sz w:val="22"/>
+        </w:rPr>
+        <w:t>1.</w:t>
+        <w:tab/>
+      </w:r>
+      <w:r>
+        <w:rPr>
+          <w:rFonts w:ascii="Times New Roman" w:hAnsi="Times New Roman"/>
+          <w:b/>
+          <w:color w:val="000000"/>
+          <w:sz w:val="22"/>
+        </w:rPr>
+        <w:t xml:space="preserve">Launch Super Admin: </w:t>
+      </w:r>
+      <w:r>
+        <w:rPr>
+          <w:rFonts w:ascii="Times New Roman" w:hAnsi="Times New Roman"/>
+          <w:color w:val="000000"/>
+          <w:sz w:val="22"/>
+        </w:rPr>
+        <w:t>Launch the Super Admin console: python run_admin.py (Default credentials: admin / admin123).</w:t>
+      </w:r>
+    </w:p>
+    <w:p>
+      <w:pPr>
+        <w:spacing w:line="276" w:lineRule="auto" w:before="0" w:after="70"/>
+        <w:ind w:left="504" w:hanging="504"/>
+      </w:pPr>
+      <w:r>
+        <w:rPr>
+          <w:rFonts w:ascii="Times New Roman" w:hAnsi="Times New Roman"/>
+          <w:b/>
+          <w:color w:val="000000"/>
+          <w:sz w:val="22"/>
+        </w:rPr>
+        <w:t>2.</w:t>
+        <w:tab/>
+      </w:r>
+      <w:r>
+        <w:rPr>
+          <w:rFonts w:ascii="Times New Roman" w:hAnsi="Times New Roman"/>
+          <w:b/>
+          <w:color w:val="000000"/>
+          <w:sz w:val="22"/>
+        </w:rPr>
+        <w:t xml:space="preserve">Open SMS Settings: </w:t>
+      </w:r>
+      <w:r>
+        <w:rPr>
+          <w:rFonts w:ascii="Times New Roman" w:hAnsi="Times New Roman"/>
+          <w:color w:val="000000"/>
+          <w:sz w:val="22"/>
+        </w:rPr>
+        <w:t>Navigate to the Settings tab and scroll to the SMS Gateway &amp; Capstone Simulation group box.</w:t>
+      </w:r>
+    </w:p>
+    <w:p>
+      <w:pPr>
+        <w:spacing w:line="276" w:lineRule="auto" w:before="0" w:after="70"/>
+        <w:ind w:left="504" w:hanging="504"/>
+      </w:pPr>
+      <w:r>
+        <w:rPr>
+          <w:rFonts w:ascii="Times New Roman" w:hAnsi="Times New Roman"/>
+          <w:b/>
+          <w:color w:val="000000"/>
+          <w:sz w:val="22"/>
+        </w:rPr>
+        <w:t>3.</w:t>
+        <w:tab/>
+      </w:r>
+      <w:r>
+        <w:rPr>
+          <w:rFonts w:ascii="Times New Roman" w:hAnsi="Times New Roman"/>
+          <w:b/>
+          <w:color w:val="000000"/>
+          <w:sz w:val="22"/>
+        </w:rPr>
+        <w:t xml:space="preserve">Input Bearer Token: </w:t>
+      </w:r>
+      <w:r>
+        <w:rPr>
+          <w:rFonts w:ascii="Times New Roman" w:hAnsi="Times New Roman"/>
+          <w:color w:val="000000"/>
+          <w:sz w:val="22"/>
+        </w:rPr>
+        <w:t>Paste your copied PhilSMS secret Bearer token into the PhilSMS API Token / Bearer Key field.</w:t>
+      </w:r>
+    </w:p>
+    <w:p>
+      <w:pPr>
+        <w:spacing w:line="276" w:lineRule="auto" w:before="0" w:after="70"/>
+        <w:ind w:left="504" w:hanging="504"/>
+      </w:pPr>
+      <w:r>
+        <w:rPr>
+          <w:rFonts w:ascii="Times New Roman" w:hAnsi="Times New Roman"/>
+          <w:b/>
+          <w:color w:val="000000"/>
+          <w:sz w:val="22"/>
+        </w:rPr>
+        <w:t>4.</w:t>
+        <w:tab/>
+      </w:r>
+      <w:r>
+        <w:rPr>
+          <w:rFonts w:ascii="Times New Roman" w:hAnsi="Times New Roman"/>
+          <w:b/>
+          <w:color w:val="000000"/>
+          <w:sz w:val="22"/>
+        </w:rPr>
+        <w:t xml:space="preserve">Set Sender ID: </w:t>
+      </w:r>
+      <w:r>
+        <w:rPr>
+          <w:rFonts w:ascii="Times New Roman" w:hAnsi="Times New Roman"/>
+          <w:color w:val="000000"/>
+          <w:sz w:val="22"/>
+        </w:rPr>
+        <w:t>Set the Sender Name / Sender ID to 'PhilSMS' (or your approved custom sender ID).</w:t>
+      </w:r>
+    </w:p>
+    <w:p>
+      <w:pPr>
+        <w:spacing w:line="276" w:lineRule="auto" w:before="0" w:after="70"/>
+        <w:ind w:left="504" w:hanging="504"/>
+      </w:pPr>
+      <w:r>
+        <w:rPr>
+          <w:rFonts w:ascii="Times New Roman" w:hAnsi="Times New Roman"/>
+          <w:b/>
+          <w:color w:val="000000"/>
+          <w:sz w:val="22"/>
+        </w:rPr>
+        <w:t>5.</w:t>
+        <w:tab/>
+      </w:r>
+      <w:r>
+        <w:rPr>
+          <w:rFonts w:ascii="Times New Roman" w:hAnsi="Times New Roman"/>
+          <w:b/>
+          <w:color w:val="000000"/>
+          <w:sz w:val="22"/>
+        </w:rPr>
+        <w:t xml:space="preserve">Confirm Endpoint: </w:t>
+      </w:r>
+      <w:r>
+        <w:rPr>
+          <w:rFonts w:ascii="Times New Roman" w:hAnsi="Times New Roman"/>
+          <w:color w:val="000000"/>
+          <w:sz w:val="22"/>
+        </w:rPr>
+        <w:t>Verify that the Gateway URL is set to https://app.philsms.com/api/v3/sms/send.</w:t>
+      </w:r>
+    </w:p>
+    <w:p>
+      <w:pPr>
+        <w:spacing w:line="276" w:lineRule="auto" w:before="0" w:after="70"/>
+        <w:ind w:left="504" w:hanging="504"/>
+      </w:pPr>
+      <w:r>
+        <w:rPr>
+          <w:rFonts w:ascii="Times New Roman" w:hAnsi="Times New Roman"/>
+          <w:b/>
+          <w:color w:val="000000"/>
+          <w:sz w:val="22"/>
+        </w:rPr>
+        <w:t>6.</w:t>
+        <w:tab/>
+      </w:r>
+      <w:r>
+        <w:rPr>
+          <w:rFonts w:ascii="Times New Roman" w:hAnsi="Times New Roman"/>
+          <w:b/>
+          <w:color w:val="000000"/>
+          <w:sz w:val="22"/>
+        </w:rPr>
+        <w:t xml:space="preserve">Activate Live Mode: </w:t>
+      </w:r>
+      <w:r>
+        <w:rPr>
+          <w:rFonts w:ascii="Times New Roman" w:hAnsi="Times New Roman"/>
+          <w:color w:val="000000"/>
+          <w:sz w:val="22"/>
+        </w:rPr>
+        <w:t>Click SWITCH TO LIVE GATEWAY. The status indicator will turn green, reading '● LIVE GATEWAY ACTIVE (PhilSMS Cloud REST API Dispatches)'.</w:t>
+      </w:r>
+    </w:p>
+    <w:p>
+      <w:pPr>
+        <w:spacing w:line="276" w:lineRule="auto" w:before="0" w:after="70"/>
+        <w:ind w:left="504" w:hanging="504"/>
+      </w:pPr>
+      <w:r>
+        <w:rPr>
+          <w:rFonts w:ascii="Times New Roman" w:hAnsi="Times New Roman"/>
+          <w:b/>
+          <w:color w:val="000000"/>
+          <w:sz w:val="22"/>
+        </w:rPr>
+        <w:t>7.</w:t>
+        <w:tab/>
+      </w:r>
+      <w:r>
+        <w:rPr>
+          <w:rFonts w:ascii="Times New Roman" w:hAnsi="Times New Roman"/>
+          <w:b/>
+          <w:color w:val="000000"/>
+          <w:sz w:val="22"/>
+        </w:rPr>
+        <w:t xml:space="preserve">Save Settings: </w:t>
+      </w:r>
+      <w:r>
+        <w:rPr>
+          <w:rFonts w:ascii="Times New Roman" w:hAnsi="Times New Roman"/>
+          <w:color w:val="000000"/>
+          <w:sz w:val="22"/>
+        </w:rPr>
+        <w:t>Click SAVE SMS CONFIGURATION to persist settings into the local SQLite settings table.</w:t>
+      </w:r>
+    </w:p>
+    <w:p>
+      <w:pPr>
+        <w:keepNext/>
+        <w:spacing w:before="140" w:after="40"/>
+      </w:pPr>
+      <w:r>
+        <w:rPr>
+          <w:rFonts w:ascii="Times New Roman" w:hAnsi="Times New Roman"/>
+          <w:b/>
+          <w:i/>
+          <w:color w:val="000000"/>
+          <w:sz w:val="22"/>
+        </w:rPr>
+        <w:t>Method B: Configuration via Environment File (.env)</w:t>
+      </w:r>
+    </w:p>
+    <w:p>
+      <w:pPr>
+        <w:spacing w:line="276" w:lineRule="auto" w:before="0" w:after="90"/>
+      </w:pPr>
+      <w:r>
+        <w:rPr>
+          <w:rFonts w:ascii="Times New Roman" w:hAnsi="Times New Roman"/>
+          <w:i w:val="0"/>
+          <w:color w:val="000000"/>
+          <w:sz w:val="22"/>
+        </w:rPr>
+        <w:t>For server deployments or automated scripting, set the following variables in your root .env file:</w:t>
+      </w:r>
+    </w:p>
+    <w:p>
+      <w:pPr>
+        <w:spacing w:line="276" w:lineRule="auto" w:before="0" w:after="90"/>
+      </w:pPr>
+      <w:r>
+        <w:rPr>
+          <w:rFonts w:ascii="Times New Roman" w:hAnsi="Times New Roman"/>
+          <w:i/>
+          <w:color w:val="000000"/>
+          <w:sz w:val="22"/>
+        </w:rPr>
+        <w:t>TAPNQUE_SMS_GATEWAY_URL=https://app.philsms.com/api/v3/sms/send</w:t>
+        <w:br/>
+        <w:t>TAPNQUE_SMS_API_KEY=your_philsms_api_token_here</w:t>
+        <w:br/>
+        <w:t>TAPNQUE_SMS_SENDER_NAME=PhilSMS</w:t>
+        <w:br/>
+        <w:t>TAPNQUE_SMS_MOCK_MODE=0</w:t>
+        <w:br/>
+        <w:t>TAPNQUE_SMS_ENABLED=1</w:t>
+      </w:r>
+    </w:p>
+    <w:p>
+      <w:pPr>
+        <w:keepNext/>
+        <w:spacing w:before="180" w:after="60"/>
+      </w:pPr>
+      <w:r>
+        <w:rPr>
+          <w:rFonts w:ascii="Times New Roman" w:hAnsi="Times New Roman"/>
+          <w:b/>
+          <w:color w:val="000000"/>
+          <w:sz w:val="23"/>
+        </w:rPr>
+        <w:t>5.6 Live Gateway Verification &amp; Test Dispatch Procedure</w:t>
+      </w:r>
+    </w:p>
+    <w:p>
+      <w:pPr>
+        <w:spacing w:line="276" w:lineRule="auto" w:before="0" w:after="70"/>
+        <w:ind w:left="504" w:hanging="504"/>
+      </w:pPr>
+      <w:r>
+        <w:rPr>
+          <w:rFonts w:ascii="Times New Roman" w:hAnsi="Times New Roman"/>
+          <w:b/>
+          <w:color w:val="000000"/>
+          <w:sz w:val="22"/>
+        </w:rPr>
+        <w:t>1.</w:t>
+        <w:tab/>
+      </w:r>
+      <w:r>
+        <w:rPr>
+          <w:rFonts w:ascii="Times New Roman" w:hAnsi="Times New Roman"/>
+          <w:b/>
+          <w:color w:val="000000"/>
+          <w:sz w:val="22"/>
+        </w:rPr>
+        <w:t xml:space="preserve">Access Test Tool: </w:t>
+      </w:r>
+      <w:r>
+        <w:rPr>
+          <w:rFonts w:ascii="Times New Roman" w:hAnsi="Times New Roman"/>
+          <w:color w:val="000000"/>
+          <w:sz w:val="22"/>
+        </w:rPr>
+        <w:t>In Super Admin &gt; Settings &gt; SMS Gateway &amp; Capstone Simulation, locate the Interactive Test Dispatch Tool.</w:t>
+      </w:r>
+    </w:p>
+    <w:p>
+      <w:pPr>
+        <w:spacing w:line="276" w:lineRule="auto" w:before="0" w:after="70"/>
+        <w:ind w:left="504" w:hanging="504"/>
+      </w:pPr>
+      <w:r>
+        <w:rPr>
+          <w:rFonts w:ascii="Times New Roman" w:hAnsi="Times New Roman"/>
+          <w:b/>
+          <w:color w:val="000000"/>
+          <w:sz w:val="22"/>
+        </w:rPr>
+        <w:t>2.</w:t>
+        <w:tab/>
+      </w:r>
+      <w:r>
+        <w:rPr>
+          <w:rFonts w:ascii="Times New Roman" w:hAnsi="Times New Roman"/>
+          <w:b/>
+          <w:color w:val="000000"/>
+          <w:sz w:val="22"/>
+        </w:rPr>
+        <w:t xml:space="preserve">Open Modal: </w:t>
+      </w:r>
+      <w:r>
+        <w:rPr>
+          <w:rFonts w:ascii="Times New Roman" w:hAnsi="Times New Roman"/>
+          <w:color w:val="000000"/>
+          <w:sz w:val="22"/>
+        </w:rPr>
+        <w:t>Click TEST DISPATCH (LIVE / MOCK) to open the interactive dispatch modal.</w:t>
+      </w:r>
+    </w:p>
+    <w:p>
+      <w:pPr>
+        <w:spacing w:line="276" w:lineRule="auto" w:before="0" w:after="70"/>
+        <w:ind w:left="504" w:hanging="504"/>
+      </w:pPr>
+      <w:r>
+        <w:rPr>
+          <w:rFonts w:ascii="Times New Roman" w:hAnsi="Times New Roman"/>
+          <w:b/>
+          <w:color w:val="000000"/>
+          <w:sz w:val="22"/>
+        </w:rPr>
+        <w:t>3.</w:t>
+        <w:tab/>
+      </w:r>
+      <w:r>
+        <w:rPr>
+          <w:rFonts w:ascii="Times New Roman" w:hAnsi="Times New Roman"/>
+          <w:b/>
+          <w:color w:val="000000"/>
+          <w:sz w:val="22"/>
+        </w:rPr>
+        <w:t xml:space="preserve">Enter Recipient: </w:t>
+      </w:r>
+      <w:r>
+        <w:rPr>
+          <w:rFonts w:ascii="Times New Roman" w:hAnsi="Times New Roman"/>
+          <w:color w:val="000000"/>
+          <w:sz w:val="22"/>
+        </w:rPr>
+        <w:t>Enter a valid 11-digit Philippine mobile number (e.g. 09XXXXXXXXX).</w:t>
+      </w:r>
+    </w:p>
+    <w:p>
+      <w:pPr>
+        <w:spacing w:line="276" w:lineRule="auto" w:before="0" w:after="70"/>
+        <w:ind w:left="504" w:hanging="504"/>
+      </w:pPr>
+      <w:r>
+        <w:rPr>
+          <w:rFonts w:ascii="Times New Roman" w:hAnsi="Times New Roman"/>
+          <w:b/>
+          <w:color w:val="000000"/>
+          <w:sz w:val="22"/>
+        </w:rPr>
+        <w:t>4.</w:t>
+        <w:tab/>
+      </w:r>
+      <w:r>
+        <w:rPr>
+          <w:rFonts w:ascii="Times New Roman" w:hAnsi="Times New Roman"/>
+          <w:b/>
+          <w:color w:val="000000"/>
+          <w:sz w:val="22"/>
+        </w:rPr>
+        <w:t xml:space="preserve">Execute Dispatch: </w:t>
+      </w:r>
+      <w:r>
+        <w:rPr>
+          <w:rFonts w:ascii="Times New Roman" w:hAnsi="Times New Roman"/>
+          <w:color w:val="000000"/>
+          <w:sz w:val="22"/>
+        </w:rPr>
+        <w:t>Click SEND TEST MESSAGE.</w:t>
+      </w:r>
+    </w:p>
+    <w:p>
+      <w:pPr>
+        <w:spacing w:line="276" w:lineRule="auto" w:before="0" w:after="70"/>
+        <w:ind w:left="504" w:hanging="504"/>
+      </w:pPr>
+      <w:r>
+        <w:rPr>
+          <w:rFonts w:ascii="Times New Roman" w:hAnsi="Times New Roman"/>
+          <w:b/>
+          <w:color w:val="000000"/>
+          <w:sz w:val="22"/>
+        </w:rPr>
+        <w:t>5.</w:t>
+        <w:tab/>
+      </w:r>
+      <w:r>
+        <w:rPr>
+          <w:rFonts w:ascii="Times New Roman" w:hAnsi="Times New Roman"/>
+          <w:b/>
+          <w:color w:val="000000"/>
+          <w:sz w:val="22"/>
+        </w:rPr>
+        <w:t xml:space="preserve">Verify Delivery: </w:t>
+      </w:r>
+      <w:r>
+        <w:rPr>
+          <w:rFonts w:ascii="Times New Roman" w:hAnsi="Times New Roman"/>
+          <w:color w:val="000000"/>
+          <w:sz w:val="22"/>
+        </w:rPr>
+        <w:t>In Live Gateway mode, verify receipt of the SMS on the physical handset within 3 to 15 seconds. In Mock Mode, verify the simulated dispatch in the terminal and in VIEW MOCK SMS LOGS.</w:t>
+      </w:r>
+    </w:p>
+    <w:p>
+      <w:pPr>
+        <w:keepNext/>
+        <w:spacing w:before="180" w:after="60"/>
+      </w:pPr>
+      <w:r>
+        <w:rPr>
+          <w:rFonts w:ascii="Times New Roman" w:hAnsi="Times New Roman"/>
+          <w:b/>
+          <w:color w:val="000000"/>
+          <w:sz w:val="23"/>
+        </w:rPr>
+        <w:t>5.7 PhilSMS API Diagnostics &amp; Error Troubleshooting Reference Table</w:t>
+      </w:r>
+    </w:p>
+    <w:tbl>
+      <w:tblPr>
+        <w:tblW w:type="auto" w:w="0"/>
+        <w:jc w:val="center"/>
+        <w:tblLayout w:type="fixed"/>
+        <w:tblLook w:firstColumn="1" w:firstRow="1" w:lastColumn="0" w:lastRow="0" w:noHBand="0" w:noVBand="1" w:val="04A0"/>
+        <w:tblBorders>
+          <w:top w:val="single" w:sz="6" w:space="0" w:color="777777"/>
+          <w:bottom w:val="single" w:sz="8" w:space="0" w:color="111111"/>
+          <w:insideH w:val="single" w:sz="4" w:space="0" w:color="CCCCCC"/>
+          <w:insideV w:val="none"/>
+          <w:left w:val="none"/>
+          <w:right w:val="none"/>
+        </w:tblBorders>
+      </w:tblPr>
+      <w:tblGrid>
+        <w:gridCol w:w="3120"/>
+        <w:gridCol w:w="3120"/>
+        <w:gridCol w:w="3120"/>
+      </w:tblGrid>
+      <w:tr>
+        <w:trPr>
+          <w:tblHeader/>
+        </w:trPr>
+        <w:tc>
+          <w:tcPr>
+            <w:tcW w:type="dxa" w:w="2304"/>
+            <w:tcMar>
+              <w:top w:w="80" w:type="dxa"/>
+              <w:bottom w:w="80" w:type="dxa"/>
+              <w:left w:w="120" w:type="dxa"/>
+              <w:right w:w="120" w:type="dxa"/>
+            </w:tcMar>
+            <w:shd w:fill="ECECEC"/>
+          </w:tcPr>
+          <w:p>
+            <w:pPr>
+              <w:spacing w:before="0" w:after="0"/>
+            </w:pPr>
+            <w:r>
+              <w:rPr>
+                <w:rFonts w:ascii="Times New Roman" w:hAnsi="Times New Roman"/>
+                <w:b/>
+                <w:color w:val="000000"/>
+                <w:sz w:val="20"/>
+              </w:rPr>
+              <w:t>HTTP Status / Error</w:t>
+            </w:r>
+          </w:p>
+        </w:tc>
+        <w:tc>
+          <w:tcPr>
+            <w:tcW w:type="dxa" w:w="3312"/>
+            <w:tcMar>
+              <w:top w:w="80" w:type="dxa"/>
+              <w:bottom w:w="80" w:type="dxa"/>
+              <w:left w:w="120" w:type="dxa"/>
+              <w:right w:w="120" w:type="dxa"/>
+            </w:tcMar>
+            <w:shd w:fill="ECECEC"/>
+          </w:tcPr>
+          <w:p>
+            <w:pPr>
+              <w:spacing w:before="0" w:after="0"/>
+            </w:pPr>
+            <w:r>
+              <w:rPr>
+                <w:rFonts w:ascii="Times New Roman" w:hAnsi="Times New Roman"/>
+                <w:b/>
+                <w:color w:val="000000"/>
+                <w:sz w:val="20"/>
+              </w:rPr>
+              <w:t>Diagnostic Cause</w:t>
+            </w:r>
+          </w:p>
+        </w:tc>
+        <w:tc>
+          <w:tcPr>
+            <w:tcW w:type="dxa" w:w="3744"/>
+            <w:tcMar>
+              <w:top w:w="80" w:type="dxa"/>
+              <w:bottom w:w="80" w:type="dxa"/>
+              <w:left w:w="120" w:type="dxa"/>
+              <w:right w:w="120" w:type="dxa"/>
+            </w:tcMar>
+            <w:shd w:fill="ECECEC"/>
+          </w:tcPr>
+          <w:p>
+            <w:pPr>
+              <w:spacing w:before="0" w:after="0"/>
+            </w:pPr>
+            <w:r>
+              <w:rPr>
+                <w:rFonts w:ascii="Times New Roman" w:hAnsi="Times New Roman"/>
+                <w:b/>
+                <w:color w:val="000000"/>
+                <w:sz w:val="20"/>
+              </w:rPr>
+              <w:t>Immediate Remediation Action</w:t>
+            </w:r>
+          </w:p>
+        </w:tc>
+      </w:tr>
+      <w:tr>
+        <w:tc>
+          <w:tcPr>
+            <w:tcW w:type="dxa" w:w="2304"/>
+            <w:tcMar>
+              <w:top w:w="70" w:type="dxa"/>
+              <w:bottom w:w="70" w:type="dxa"/>
+              <w:left w:w="120" w:type="dxa"/>
+              <w:right w:w="120" w:type="dxa"/>
+            </w:tcMar>
+          </w:tcPr>
+          <w:p>
+            <w:pPr>
+              <w:spacing w:before="0" w:after="0"/>
+            </w:pPr>
+            <w:r>
+              <w:rPr>
+                <w:rFonts w:ascii="Times New Roman" w:hAnsi="Times New Roman"/>
+                <w:color w:val="000000"/>
+                <w:sz w:val="19"/>
+              </w:rPr>
+              <w:t>HTTP 200 OK (success: true)</w:t>
+            </w:r>
+          </w:p>
+        </w:tc>
+        <w:tc>
+          <w:tcPr>
+            <w:tcW w:type="dxa" w:w="3312"/>
+            <w:tcMar>
+              <w:top w:w="70" w:type="dxa"/>
+              <w:bottom w:w="70" w:type="dxa"/>
+              <w:left w:w="120" w:type="dxa"/>
+              <w:right w:w="120" w:type="dxa"/>
+            </w:tcMar>
+          </w:tcPr>
+          <w:p>
+            <w:pPr>
+              <w:spacing w:before="0" w:after="0"/>
+            </w:pPr>
+            <w:r>
+              <w:rPr>
+                <w:rFonts w:ascii="Times New Roman" w:hAnsi="Times New Roman"/>
+                <w:color w:val="000000"/>
+                <w:sz w:val="19"/>
+              </w:rPr>
+              <w:t>Message accepted by PhilSMS gateway and enqueued for telco dispatch</w:t>
+            </w:r>
+          </w:p>
+        </w:tc>
+        <w:tc>
+          <w:tcPr>
+            <w:tcW w:type="dxa" w:w="3744"/>
+            <w:tcMar>
+              <w:top w:w="70" w:type="dxa"/>
+              <w:bottom w:w="70" w:type="dxa"/>
+              <w:left w:w="120" w:type="dxa"/>
+              <w:right w:w="120" w:type="dxa"/>
+            </w:tcMar>
+          </w:tcPr>
+          <w:p>
+            <w:pPr>
+              <w:spacing w:before="0" w:after="0"/>
+            </w:pPr>
+            <w:r>
+              <w:rPr>
+                <w:rFonts w:ascii="Times New Roman" w:hAnsi="Times New Roman"/>
+                <w:color w:val="000000"/>
+                <w:sz w:val="19"/>
+              </w:rPr>
+              <w:t>Normal operation; message will be delivered to the carrier network.</w:t>
+            </w:r>
+          </w:p>
+        </w:tc>
+      </w:tr>
+      <w:tr>
+        <w:tc>
+          <w:tcPr>
+            <w:tcW w:type="dxa" w:w="2304"/>
+            <w:tcMar>
+              <w:top w:w="70" w:type="dxa"/>
+              <w:bottom w:w="70" w:type="dxa"/>
+              <w:left w:w="120" w:type="dxa"/>
+              <w:right w:w="120" w:type="dxa"/>
+            </w:tcMar>
+            <w:shd w:fill="FBFBFB"/>
+          </w:tcPr>
+          <w:p>
+            <w:pPr>
+              <w:spacing w:before="0" w:after="0"/>
+            </w:pPr>
+            <w:r>
+              <w:rPr>
+                <w:rFonts w:ascii="Times New Roman" w:hAnsi="Times New Roman"/>
+                <w:color w:val="000000"/>
+                <w:sz w:val="19"/>
+              </w:rPr>
+              <w:t>HTTP 401 Unauthorized</w:t>
+            </w:r>
+          </w:p>
+        </w:tc>
+        <w:tc>
+          <w:tcPr>
+            <w:tcW w:type="dxa" w:w="3312"/>
+            <w:tcMar>
+              <w:top w:w="70" w:type="dxa"/>
+              <w:bottom w:w="70" w:type="dxa"/>
+              <w:left w:w="120" w:type="dxa"/>
+              <w:right w:w="120" w:type="dxa"/>
+            </w:tcMar>
+            <w:shd w:fill="FBFBFB"/>
+          </w:tcPr>
+          <w:p>
+            <w:pPr>
+              <w:spacing w:before="0" w:after="0"/>
+            </w:pPr>
+            <w:r>
+              <w:rPr>
+                <w:rFonts w:ascii="Times New Roman" w:hAnsi="Times New Roman"/>
+                <w:color w:val="000000"/>
+                <w:sz w:val="19"/>
+              </w:rPr>
+              <w:t>The API Bearer token is missing, expired, or typed incorrectly</w:t>
+            </w:r>
+          </w:p>
+        </w:tc>
+        <w:tc>
+          <w:tcPr>
+            <w:tcW w:type="dxa" w:w="3744"/>
+            <w:tcMar>
+              <w:top w:w="70" w:type="dxa"/>
+              <w:bottom w:w="70" w:type="dxa"/>
+              <w:left w:w="120" w:type="dxa"/>
+              <w:right w:w="120" w:type="dxa"/>
+            </w:tcMar>
+            <w:shd w:fill="FBFBFB"/>
+          </w:tcPr>
+          <w:p>
+            <w:pPr>
+              <w:spacing w:before="0" w:after="0"/>
+            </w:pPr>
+            <w:r>
+              <w:rPr>
+                <w:rFonts w:ascii="Times New Roman" w:hAnsi="Times New Roman"/>
+                <w:color w:val="000000"/>
+                <w:sz w:val="19"/>
+              </w:rPr>
+              <w:t>Verify the Bearer token in Super Admin Settings or .env. Re-generate token if necessary.</w:t>
+            </w:r>
+          </w:p>
+        </w:tc>
+      </w:tr>
+      <w:tr>
+        <w:tc>
+          <w:tcPr>
+            <w:tcW w:type="dxa" w:w="2304"/>
+            <w:tcMar>
+              <w:top w:w="70" w:type="dxa"/>
+              <w:bottom w:w="70" w:type="dxa"/>
+              <w:left w:w="120" w:type="dxa"/>
+              <w:right w:w="120" w:type="dxa"/>
+            </w:tcMar>
+          </w:tcPr>
+          <w:p>
+            <w:pPr>
+              <w:spacing w:before="0" w:after="0"/>
+            </w:pPr>
+            <w:r>
+              <w:rPr>
+                <w:rFonts w:ascii="Times New Roman" w:hAnsi="Times New Roman"/>
+                <w:color w:val="000000"/>
+                <w:sz w:val="19"/>
+              </w:rPr>
+              <w:t>HTTP 403 Forbidden</w:t>
+            </w:r>
+          </w:p>
+        </w:tc>
+        <w:tc>
+          <w:tcPr>
+            <w:tcW w:type="dxa" w:w="3312"/>
+            <w:tcMar>
+              <w:top w:w="70" w:type="dxa"/>
+              <w:bottom w:w="70" w:type="dxa"/>
+              <w:left w:w="120" w:type="dxa"/>
+              <w:right w:w="120" w:type="dxa"/>
+            </w:tcMar>
+          </w:tcPr>
+          <w:p>
+            <w:pPr>
+              <w:spacing w:before="0" w:after="0"/>
+            </w:pPr>
+            <w:r>
+              <w:rPr>
+                <w:rFonts w:ascii="Times New Roman" w:hAnsi="Times New Roman"/>
+                <w:color w:val="000000"/>
+                <w:sz w:val="19"/>
+              </w:rPr>
+              <w:t>Requested Sender ID is unapproved or account requires verification</w:t>
+            </w:r>
+          </w:p>
+        </w:tc>
+        <w:tc>
+          <w:tcPr>
+            <w:tcW w:type="dxa" w:w="3744"/>
+            <w:tcMar>
+              <w:top w:w="70" w:type="dxa"/>
+              <w:bottom w:w="70" w:type="dxa"/>
+              <w:left w:w="120" w:type="dxa"/>
+              <w:right w:w="120" w:type="dxa"/>
+            </w:tcMar>
+          </w:tcPr>
+          <w:p>
+            <w:pPr>
+              <w:spacing w:before="0" w:after="0"/>
+            </w:pPr>
+            <w:r>
+              <w:rPr>
+                <w:rFonts w:ascii="Times New Roman" w:hAnsi="Times New Roman"/>
+                <w:color w:val="000000"/>
+                <w:sz w:val="19"/>
+              </w:rPr>
+              <w:t>Set Sender ID back to default 'PhilSMS'. Verify email activation in portal.</w:t>
+            </w:r>
+          </w:p>
+        </w:tc>
+      </w:tr>
+      <w:tr>
+        <w:tc>
+          <w:tcPr>
+            <w:tcW w:type="dxa" w:w="2304"/>
+            <w:tcMar>
+              <w:top w:w="70" w:type="dxa"/>
+              <w:bottom w:w="70" w:type="dxa"/>
+              <w:left w:w="120" w:type="dxa"/>
+              <w:right w:w="120" w:type="dxa"/>
+            </w:tcMar>
+            <w:shd w:fill="FBFBFB"/>
+          </w:tcPr>
+          <w:p>
+            <w:pPr>
+              <w:spacing w:before="0" w:after="0"/>
+            </w:pPr>
+            <w:r>
+              <w:rPr>
+                <w:rFonts w:ascii="Times New Roman" w:hAnsi="Times New Roman"/>
+                <w:color w:val="000000"/>
+                <w:sz w:val="19"/>
+              </w:rPr>
+              <w:t>HTTP 422 Unprocessable Entity</w:t>
+            </w:r>
+          </w:p>
+        </w:tc>
+        <w:tc>
+          <w:tcPr>
+            <w:tcW w:type="dxa" w:w="3312"/>
+            <w:tcMar>
+              <w:top w:w="70" w:type="dxa"/>
+              <w:bottom w:w="70" w:type="dxa"/>
+              <w:left w:w="120" w:type="dxa"/>
+              <w:right w:w="120" w:type="dxa"/>
+            </w:tcMar>
+            <w:shd w:fill="FBFBFB"/>
+          </w:tcPr>
+          <w:p>
+            <w:pPr>
+              <w:spacing w:before="0" w:after="0"/>
+            </w:pPr>
+            <w:r>
+              <w:rPr>
+                <w:rFonts w:ascii="Times New Roman" w:hAnsi="Times New Roman"/>
+                <w:color w:val="000000"/>
+                <w:sz w:val="19"/>
+              </w:rPr>
+              <w:t>Recipient phone number is invalid or required parameter missing</w:t>
+            </w:r>
+          </w:p>
+        </w:tc>
+        <w:tc>
+          <w:tcPr>
+            <w:tcW w:type="dxa" w:w="3744"/>
+            <w:tcMar>
+              <w:top w:w="70" w:type="dxa"/>
+              <w:bottom w:w="70" w:type="dxa"/>
+              <w:left w:w="120" w:type="dxa"/>
+              <w:right w:w="120" w:type="dxa"/>
+            </w:tcMar>
+            <w:shd w:fill="FBFBFB"/>
+          </w:tcPr>
+          <w:p>
+            <w:pPr>
+              <w:spacing w:before="0" w:after="0"/>
+            </w:pPr>
+            <w:r>
+              <w:rPr>
+                <w:rFonts w:ascii="Times New Roman" w:hAnsi="Times New Roman"/>
+                <w:color w:val="000000"/>
+                <w:sz w:val="19"/>
+              </w:rPr>
+              <w:t>Ensure phone number conforms to 11-digit format (09XXXXXXXXX). Check message body.</w:t>
+            </w:r>
+          </w:p>
+        </w:tc>
+      </w:tr>
+      <w:tr>
+        <w:tc>
+          <w:tcPr>
+            <w:tcW w:type="dxa" w:w="2304"/>
+            <w:tcMar>
+              <w:top w:w="70" w:type="dxa"/>
+              <w:bottom w:w="70" w:type="dxa"/>
+              <w:left w:w="120" w:type="dxa"/>
+              <w:right w:w="120" w:type="dxa"/>
+            </w:tcMar>
+          </w:tcPr>
+          <w:p>
+            <w:pPr>
+              <w:spacing w:before="0" w:after="0"/>
+            </w:pPr>
+            <w:r>
+              <w:rPr>
+                <w:rFonts w:ascii="Times New Roman" w:hAnsi="Times New Roman"/>
+                <w:color w:val="000000"/>
+                <w:sz w:val="19"/>
+              </w:rPr>
+              <w:t>HTTP 402 / Insufficient Balance</w:t>
+            </w:r>
+          </w:p>
+        </w:tc>
+        <w:tc>
+          <w:tcPr>
+            <w:tcW w:type="dxa" w:w="3312"/>
+            <w:tcMar>
+              <w:top w:w="70" w:type="dxa"/>
+              <w:bottom w:w="70" w:type="dxa"/>
+              <w:left w:w="120" w:type="dxa"/>
+              <w:right w:w="120" w:type="dxa"/>
+            </w:tcMar>
+          </w:tcPr>
+          <w:p>
+            <w:pPr>
+              <w:spacing w:before="0" w:after="0"/>
+            </w:pPr>
+            <w:r>
+              <w:rPr>
+                <w:rFonts w:ascii="Times New Roman" w:hAnsi="Times New Roman"/>
+                <w:color w:val="000000"/>
+                <w:sz w:val="19"/>
+              </w:rPr>
+              <w:t>Account SMS balance has depleted to zero</w:t>
+            </w:r>
+          </w:p>
+        </w:tc>
+        <w:tc>
+          <w:tcPr>
+            <w:tcW w:type="dxa" w:w="3744"/>
+            <w:tcMar>
+              <w:top w:w="70" w:type="dxa"/>
+              <w:bottom w:w="70" w:type="dxa"/>
+              <w:left w:w="120" w:type="dxa"/>
+              <w:right w:w="120" w:type="dxa"/>
+            </w:tcMar>
+          </w:tcPr>
+          <w:p>
+            <w:pPr>
+              <w:spacing w:before="0" w:after="0"/>
+            </w:pPr>
+            <w:r>
+              <w:rPr>
+                <w:rFonts w:ascii="Times New Roman" w:hAnsi="Times New Roman"/>
+                <w:color w:val="000000"/>
+                <w:sz w:val="19"/>
+              </w:rPr>
+              <w:t>Log in to https://app.philsms.com/ and reload credits via GCash or Maya.</w:t>
+            </w:r>
+          </w:p>
+        </w:tc>
+      </w:tr>
+      <w:tr>
+        <w:tc>
+          <w:tcPr>
+            <w:tcW w:type="dxa" w:w="2304"/>
+            <w:tcMar>
+              <w:top w:w="70" w:type="dxa"/>
+              <w:bottom w:w="70" w:type="dxa"/>
+              <w:left w:w="120" w:type="dxa"/>
+              <w:right w:w="120" w:type="dxa"/>
+            </w:tcMar>
+            <w:shd w:fill="FBFBFB"/>
+          </w:tcPr>
+          <w:p>
+            <w:pPr>
+              <w:spacing w:before="0" w:after="0"/>
+            </w:pPr>
+            <w:r>
+              <w:rPr>
+                <w:rFonts w:ascii="Times New Roman" w:hAnsi="Times New Roman"/>
+                <w:color w:val="000000"/>
+                <w:sz w:val="19"/>
+              </w:rPr>
+              <w:t>Connection Timeout (&gt; 8s)</w:t>
+            </w:r>
+          </w:p>
+        </w:tc>
+        <w:tc>
+          <w:tcPr>
+            <w:tcW w:type="dxa" w:w="3312"/>
+            <w:tcMar>
+              <w:top w:w="70" w:type="dxa"/>
+              <w:bottom w:w="70" w:type="dxa"/>
+              <w:left w:w="120" w:type="dxa"/>
+              <w:right w:w="120" w:type="dxa"/>
+            </w:tcMar>
+            <w:shd w:fill="FBFBFB"/>
+          </w:tcPr>
+          <w:p>
+            <w:pPr>
+              <w:spacing w:before="0" w:after="0"/>
+            </w:pPr>
+            <w:r>
+              <w:rPr>
+                <w:rFonts w:ascii="Times New Roman" w:hAnsi="Times New Roman"/>
+                <w:color w:val="000000"/>
+                <w:sz w:val="19"/>
+              </w:rPr>
+              <w:t>Internet connectivity disruption between station and PhilSMS cloud</w:t>
+            </w:r>
+          </w:p>
+        </w:tc>
+        <w:tc>
+          <w:tcPr>
+            <w:tcW w:type="dxa" w:w="3744"/>
+            <w:tcMar>
+              <w:top w:w="70" w:type="dxa"/>
+              <w:bottom w:w="70" w:type="dxa"/>
+              <w:left w:w="120" w:type="dxa"/>
+              <w:right w:w="120" w:type="dxa"/>
+            </w:tcMar>
+            <w:shd w:fill="FBFBFB"/>
+          </w:tcPr>
+          <w:p>
+            <w:pPr>
+              <w:spacing w:before="0" w:after="0"/>
+            </w:pPr>
+            <w:r>
+              <w:rPr>
+                <w:rFonts w:ascii="Times New Roman" w:hAnsi="Times New Roman"/>
+                <w:color w:val="000000"/>
+                <w:sz w:val="19"/>
+              </w:rPr>
+              <w:t>Check campus Wi-Fi / Ethernet connection. The daemon logs error without crashing station.</w:t>
+            </w:r>
+          </w:p>
+        </w:tc>
+      </w:tr>
+    </w:tbl>
+    <w:p>
+      <w:pPr>
+        <w:spacing w:after="120"/>
+      </w:pPr>
+    </w:p>
+    <w:p>
+      <w:pPr>
+        <w:keepNext/>
+        <w:spacing w:before="280" w:after="80"/>
+      </w:pPr>
+      <w:r>
+        <w:rPr>
+          <w:rFonts w:ascii="Times New Roman" w:hAnsi="Times New Roman"/>
+          <w:b/>
+          <w:color w:val="000000"/>
+          <w:sz w:val="26"/>
+        </w:rPr>
+        <w:t>6. Safe Capstone Mock Simulation Mode</w:t>
       </w:r>
     </w:p>
     <w:p>
@@ -2530,7 +4199,7 @@
     <w:p>
       <w:pPr>
         <w:keepNext/>
-        <w:spacing w:before="260" w:after="80"/>
+        <w:spacing w:before="280" w:after="80"/>
       </w:pPr>
       <w:r>
         <w:rPr>
@@ -2539,7 +4208,7 @@
           <w:color w:val="000000"/>
           <w:sz w:val="26"/>
         </w:rPr>
-        <w:t>6. Step-by-Step Deployment &amp; Operations Guide</w:t>
+        <w:t>7. Step-by-Step Deployment &amp; Operations Guide</w:t>
       </w:r>
     </w:p>
     <w:p>
@@ -2568,7 +4237,7 @@
           <w:color w:val="000000"/>
           <w:sz w:val="23"/>
         </w:rPr>
-        <w:t>6.1 Environment Setup &amp; Installation</w:t>
+        <w:t>7.1 Environment Setup &amp; Installation</w:t>
       </w:r>
     </w:p>
     <w:p>
@@ -2715,7 +4384,7 @@
           <w:color w:val="000000"/>
           <w:sz w:val="23"/>
         </w:rPr>
-        <w:t>6.2 Launching System Stations</w:t>
+        <w:t>7.2 Launching System Stations</w:t>
       </w:r>
     </w:p>
     <w:tbl>
@@ -3257,7 +4926,7 @@
     <w:p>
       <w:pPr>
         <w:keepNext/>
-        <w:spacing w:before="260" w:after="80"/>
+        <w:spacing w:before="280" w:after="80"/>
       </w:pPr>
       <w:r>
         <w:rPr>
@@ -3266,7 +4935,7 @@
           <w:color w:val="000000"/>
           <w:sz w:val="26"/>
         </w:rPr>
-        <w:t>7. Database Schema &amp; Data Dictionary</w:t>
+        <w:t>8. Database Schema &amp; Data Dictionary</w:t>
       </w:r>
     </w:p>
     <w:p>
@@ -3295,7 +4964,7 @@
           <w:color w:val="000000"/>
           <w:sz w:val="23"/>
         </w:rPr>
-        <w:t>7.1 Tickets Table Schema</w:t>
+        <w:t>8.1 Tickets Table Schema</w:t>
       </w:r>
     </w:p>
     <w:tbl>
@@ -5246,7 +6915,7 @@
           <w:color w:val="000000"/>
           <w:sz w:val="23"/>
         </w:rPr>
-        <w:t>7.2 Settings Table Schema</w:t>
+        <w:t>8.2 Settings Table Schema</w:t>
       </w:r>
     </w:p>
     <w:p>
@@ -5472,7 +7141,7 @@
         <w:color w:val="000000"/>
         <w:sz w:val="18"/>
       </w:rPr>
-      <w:t>TapNQue • PhilSMS Cloud API System Guide (Doc ID: TNQ-DOC-MAN-2026-03-PHILSMS)</w:t>
+      <w:t>TapNQue • PhilSMS Cloud API System Guide &amp; Setup Manual (Doc ID: TNQ-DOC-MAN-2026-03-PHILSMS)</w:t>
     </w:r>
   </w:p>
 </w:ftr>

</xml_diff>

<commit_message>
docs(guide): add hands-on PhilSMS simulation walkthrough section to manual
</commit_message>
<xml_diff>
--- a/docs/11-09-2026_TapNQue_Comprehensive_System_Guide_and_PhilSMS_Manual.docx
+++ b/docs/11-09-2026_TapNQue_Comprehensive_System_Guide_and_PhilSMS_Manual.docx
@@ -29,7 +29,7 @@
           <w:color w:val="000000"/>
           <w:sz w:val="23"/>
         </w:rPr>
-        <w:t>Comprehensive System Architecture, Administrative Authentication Guide, and PhilSMS Cloud API Operations Manual</w:t>
+        <w:t>Comprehensive System Architecture, Administrative Authentication Guide, PhilSMS Cloud API Operations Manual, and Hands-On Simulation Walkthrough</w:t>
       </w:r>
     </w:p>
     <w:p>
@@ -4085,7 +4085,792 @@
           <w:color w:val="000000"/>
           <w:sz w:val="26"/>
         </w:rPr>
-        <w:t>6. Safe Capstone Mock Simulation Mode</w:t>
+        <w:t>6. Step-by-Step Hands-On PhilSMS Simulation Walkthrough</w:t>
+      </w:r>
+    </w:p>
+    <w:p>
+      <w:pPr>
+        <w:spacing w:line="276" w:lineRule="auto" w:before="0" w:after="90"/>
+      </w:pPr>
+      <w:r>
+        <w:rPr>
+          <w:rFonts w:ascii="Times New Roman" w:hAnsi="Times New Roman"/>
+          <w:i w:val="0"/>
+          <w:color w:val="000000"/>
+          <w:sz w:val="22"/>
+        </w:rPr>
+        <w:t>To ensure thesis panelists, faculty evaluators, and system administrators can thoroughly verify the end-to-end PhilSMS notification lifecycle without spending prepaid SMS credits or requiring active internet connectivity, execute the following structured hands-on walkthrough:</w:t>
+      </w:r>
+    </w:p>
+    <w:p>
+      <w:pPr>
+        <w:keepNext/>
+        <w:spacing w:before="180" w:after="60"/>
+      </w:pPr>
+      <w:r>
+        <w:rPr>
+          <w:rFonts w:ascii="Times New Roman" w:hAnsi="Times New Roman"/>
+          <w:b/>
+          <w:color w:val="000000"/>
+          <w:sz w:val="23"/>
+        </w:rPr>
+        <w:t>Phase 1: Verify Super Admin Settings &amp; On-Demand Test Dispatch</w:t>
+      </w:r>
+    </w:p>
+    <w:p>
+      <w:pPr>
+        <w:spacing w:line="276" w:lineRule="auto" w:before="0" w:after="70"/>
+        <w:ind w:left="504" w:hanging="504"/>
+      </w:pPr>
+      <w:r>
+        <w:rPr>
+          <w:rFonts w:ascii="Times New Roman" w:hAnsi="Times New Roman"/>
+          <w:b/>
+          <w:color w:val="000000"/>
+          <w:sz w:val="22"/>
+        </w:rPr>
+        <w:t>1.</w:t>
+        <w:tab/>
+      </w:r>
+      <w:r>
+        <w:rPr>
+          <w:rFonts w:ascii="Times New Roman" w:hAnsi="Times New Roman"/>
+          <w:b/>
+          <w:color w:val="000000"/>
+          <w:sz w:val="22"/>
+        </w:rPr>
+        <w:t xml:space="preserve">Launch Super Admin: </w:t>
+      </w:r>
+      <w:r>
+        <w:rPr>
+          <w:rFonts w:ascii="Times New Roman" w:hAnsi="Times New Roman"/>
+          <w:color w:val="000000"/>
+          <w:sz w:val="22"/>
+        </w:rPr>
+        <w:t>Launch the Super Admin Console in a terminal: python run_admin.py. Log in using default credentials (Username: admin, Password: admin123).</w:t>
+      </w:r>
+    </w:p>
+    <w:p>
+      <w:pPr>
+        <w:spacing w:line="276" w:lineRule="auto" w:before="0" w:after="70"/>
+        <w:ind w:left="504" w:hanging="504"/>
+      </w:pPr>
+      <w:r>
+        <w:rPr>
+          <w:rFonts w:ascii="Times New Roman" w:hAnsi="Times New Roman"/>
+          <w:b/>
+          <w:color w:val="000000"/>
+          <w:sz w:val="22"/>
+        </w:rPr>
+        <w:t>2.</w:t>
+        <w:tab/>
+      </w:r>
+      <w:r>
+        <w:rPr>
+          <w:rFonts w:ascii="Times New Roman" w:hAnsi="Times New Roman"/>
+          <w:b/>
+          <w:color w:val="000000"/>
+          <w:sz w:val="22"/>
+        </w:rPr>
+        <w:t xml:space="preserve">Open SMS Panel: </w:t>
+      </w:r>
+      <w:r>
+        <w:rPr>
+          <w:rFonts w:ascii="Times New Roman" w:hAnsi="Times New Roman"/>
+          <w:color w:val="000000"/>
+          <w:sz w:val="22"/>
+        </w:rPr>
+        <w:t>Navigate to the Settings tab and scroll to the SMS Gateway &amp; Capstone Simulation section.</w:t>
+      </w:r>
+    </w:p>
+    <w:p>
+      <w:pPr>
+        <w:spacing w:line="276" w:lineRule="auto" w:before="0" w:after="70"/>
+        <w:ind w:left="504" w:hanging="504"/>
+      </w:pPr>
+      <w:r>
+        <w:rPr>
+          <w:rFonts w:ascii="Times New Roman" w:hAnsi="Times New Roman"/>
+          <w:b/>
+          <w:color w:val="000000"/>
+          <w:sz w:val="22"/>
+        </w:rPr>
+        <w:t>3.</w:t>
+        <w:tab/>
+      </w:r>
+      <w:r>
+        <w:rPr>
+          <w:rFonts w:ascii="Times New Roman" w:hAnsi="Times New Roman"/>
+          <w:b/>
+          <w:color w:val="000000"/>
+          <w:sz w:val="22"/>
+        </w:rPr>
+        <w:t xml:space="preserve">Verify Mock Badge: </w:t>
+      </w:r>
+      <w:r>
+        <w:rPr>
+          <w:rFonts w:ascii="Times New Roman" w:hAnsi="Times New Roman"/>
+          <w:color w:val="000000"/>
+          <w:sz w:val="22"/>
+        </w:rPr>
+        <w:t>Confirm that the mode status badge displays: ● MOCK MODE ACTIVE (Safe Capstone Simulation — Local Logging Only, Zero Credit Cost).</w:t>
+      </w:r>
+    </w:p>
+    <w:p>
+      <w:pPr>
+        <w:spacing w:line="276" w:lineRule="auto" w:before="0" w:after="70"/>
+        <w:ind w:left="504" w:hanging="504"/>
+      </w:pPr>
+      <w:r>
+        <w:rPr>
+          <w:rFonts w:ascii="Times New Roman" w:hAnsi="Times New Roman"/>
+          <w:b/>
+          <w:color w:val="000000"/>
+          <w:sz w:val="22"/>
+        </w:rPr>
+        <w:t>4.</w:t>
+        <w:tab/>
+      </w:r>
+      <w:r>
+        <w:rPr>
+          <w:rFonts w:ascii="Times New Roman" w:hAnsi="Times New Roman"/>
+          <w:b/>
+          <w:color w:val="000000"/>
+          <w:sz w:val="22"/>
+        </w:rPr>
+        <w:t xml:space="preserve">Open Test Modal: </w:t>
+      </w:r>
+      <w:r>
+        <w:rPr>
+          <w:rFonts w:ascii="Times New Roman" w:hAnsi="Times New Roman"/>
+          <w:color w:val="000000"/>
+          <w:sz w:val="22"/>
+        </w:rPr>
+        <w:t>Click the TEST DISPATCH (LIVE / MOCK) button to launch the test dispatch modal.</w:t>
+      </w:r>
+    </w:p>
+    <w:p>
+      <w:pPr>
+        <w:spacing w:line="276" w:lineRule="auto" w:before="0" w:after="70"/>
+        <w:ind w:left="504" w:hanging="504"/>
+      </w:pPr>
+      <w:r>
+        <w:rPr>
+          <w:rFonts w:ascii="Times New Roman" w:hAnsi="Times New Roman"/>
+          <w:b/>
+          <w:color w:val="000000"/>
+          <w:sz w:val="22"/>
+        </w:rPr>
+        <w:t>5.</w:t>
+        <w:tab/>
+      </w:r>
+      <w:r>
+        <w:rPr>
+          <w:rFonts w:ascii="Times New Roman" w:hAnsi="Times New Roman"/>
+          <w:b/>
+          <w:color w:val="000000"/>
+          <w:sz w:val="22"/>
+        </w:rPr>
+        <w:t xml:space="preserve">Execute Test: </w:t>
+      </w:r>
+      <w:r>
+        <w:rPr>
+          <w:rFonts w:ascii="Times New Roman" w:hAnsi="Times New Roman"/>
+          <w:color w:val="000000"/>
+          <w:sz w:val="22"/>
+        </w:rPr>
+        <w:t>Enter test recipient phone number: 09171234567, and click SEND TEST MESSAGE.</w:t>
+      </w:r>
+    </w:p>
+    <w:p>
+      <w:pPr>
+        <w:spacing w:line="276" w:lineRule="auto" w:before="0" w:after="70"/>
+        <w:ind w:left="504" w:hanging="504"/>
+      </w:pPr>
+      <w:r>
+        <w:rPr>
+          <w:rFonts w:ascii="Times New Roman" w:hAnsi="Times New Roman"/>
+          <w:b/>
+          <w:color w:val="000000"/>
+          <w:sz w:val="22"/>
+        </w:rPr>
+        <w:t>6.</w:t>
+        <w:tab/>
+      </w:r>
+      <w:r>
+        <w:rPr>
+          <w:rFonts w:ascii="Times New Roman" w:hAnsi="Times New Roman"/>
+          <w:b/>
+          <w:color w:val="000000"/>
+          <w:sz w:val="22"/>
+        </w:rPr>
+        <w:t xml:space="preserve">Audit Mock Dispatch: </w:t>
+      </w:r>
+      <w:r>
+        <w:rPr>
+          <w:rFonts w:ascii="Times New Roman" w:hAnsi="Times New Roman"/>
+          <w:color w:val="000000"/>
+          <w:sz w:val="22"/>
+        </w:rPr>
+        <w:t>Confirm the success notification prompt appears. Click VIEW MOCK SMS LOGS to inspect the SMSLogDialog audit table containing the recorded test entry with timestamp, recipient, and message text.</w:t>
+      </w:r>
+    </w:p>
+    <w:p>
+      <w:pPr>
+        <w:keepNext/>
+        <w:spacing w:before="180" w:after="60"/>
+      </w:pPr>
+      <w:r>
+        <w:rPr>
+          <w:rFonts w:ascii="Times New Roman" w:hAnsi="Times New Roman"/>
+          <w:b/>
+          <w:color w:val="000000"/>
+          <w:sz w:val="23"/>
+        </w:rPr>
+        <w:t>Phase 2: Generate Ticket on Student Kiosk (Trigger 1: CREATED)</w:t>
+      </w:r>
+    </w:p>
+    <w:p>
+      <w:pPr>
+        <w:spacing w:line="276" w:lineRule="auto" w:before="0" w:after="70"/>
+        <w:ind w:left="504" w:hanging="504"/>
+      </w:pPr>
+      <w:r>
+        <w:rPr>
+          <w:rFonts w:ascii="Times New Roman" w:hAnsi="Times New Roman"/>
+          <w:b/>
+          <w:color w:val="000000"/>
+          <w:sz w:val="22"/>
+        </w:rPr>
+        <w:t>1.</w:t>
+        <w:tab/>
+      </w:r>
+      <w:r>
+        <w:rPr>
+          <w:rFonts w:ascii="Times New Roman" w:hAnsi="Times New Roman"/>
+          <w:b/>
+          <w:color w:val="000000"/>
+          <w:sz w:val="22"/>
+        </w:rPr>
+        <w:t xml:space="preserve">Launch Kiosk Terminal: </w:t>
+      </w:r>
+      <w:r>
+        <w:rPr>
+          <w:rFonts w:ascii="Times New Roman" w:hAnsi="Times New Roman"/>
+          <w:color w:val="000000"/>
+          <w:sz w:val="22"/>
+        </w:rPr>
+        <w:t>In a separate terminal window, start the Student Registration Kiosk: python run_kiosk.py.</w:t>
+      </w:r>
+    </w:p>
+    <w:p>
+      <w:pPr>
+        <w:spacing w:line="276" w:lineRule="auto" w:before="0" w:after="70"/>
+        <w:ind w:left="504" w:hanging="504"/>
+      </w:pPr>
+      <w:r>
+        <w:rPr>
+          <w:rFonts w:ascii="Times New Roman" w:hAnsi="Times New Roman"/>
+          <w:b/>
+          <w:color w:val="000000"/>
+          <w:sz w:val="22"/>
+        </w:rPr>
+        <w:t>2.</w:t>
+        <w:tab/>
+      </w:r>
+      <w:r>
+        <w:rPr>
+          <w:rFonts w:ascii="Times New Roman" w:hAnsi="Times New Roman"/>
+          <w:b/>
+          <w:color w:val="000000"/>
+          <w:sz w:val="22"/>
+        </w:rPr>
+        <w:t xml:space="preserve">Enter Student Information: </w:t>
+      </w:r>
+      <w:r>
+        <w:rPr>
+          <w:rFonts w:ascii="Times New Roman" w:hAnsi="Times New Roman"/>
+          <w:color w:val="000000"/>
+          <w:sz w:val="22"/>
+        </w:rPr>
+        <w:t>On the touchscreen check-in form, enter the following demonstration student profile:</w:t>
+        <w:br/>
+        <w:t>• Student Full Name: Juan Dela Cruz</w:t>
+        <w:br/>
+        <w:t>• Student Identification Number: 2023-10042</w:t>
+        <w:br/>
+        <w:t>• Philippine Mobile Number: 0917 987 6543</w:t>
+        <w:br/>
+        <w:t>• Visitor Classification: Student</w:t>
+        <w:br/>
+        <w:t>• Purpose of Visit: Enrollment</w:t>
+      </w:r>
+    </w:p>
+    <w:p>
+      <w:pPr>
+        <w:spacing w:line="276" w:lineRule="auto" w:before="0" w:after="70"/>
+        <w:ind w:left="504" w:hanging="504"/>
+      </w:pPr>
+      <w:r>
+        <w:rPr>
+          <w:rFonts w:ascii="Times New Roman" w:hAnsi="Times New Roman"/>
+          <w:b/>
+          <w:color w:val="000000"/>
+          <w:sz w:val="22"/>
+        </w:rPr>
+        <w:t>3.</w:t>
+        <w:tab/>
+      </w:r>
+      <w:r>
+        <w:rPr>
+          <w:rFonts w:ascii="Times New Roman" w:hAnsi="Times New Roman"/>
+          <w:b/>
+          <w:color w:val="000000"/>
+          <w:sz w:val="22"/>
+        </w:rPr>
+        <w:t xml:space="preserve">Submit Registration: </w:t>
+      </w:r>
+      <w:r>
+        <w:rPr>
+          <w:rFonts w:ascii="Times New Roman" w:hAnsi="Times New Roman"/>
+          <w:color w:val="000000"/>
+          <w:sz w:val="22"/>
+        </w:rPr>
+        <w:t>Click the prominent green GET TICKET button.</w:t>
+      </w:r>
+    </w:p>
+    <w:p>
+      <w:pPr>
+        <w:spacing w:line="276" w:lineRule="auto" w:before="0" w:after="70"/>
+        <w:ind w:left="504" w:hanging="504"/>
+      </w:pPr>
+      <w:r>
+        <w:rPr>
+          <w:rFonts w:ascii="Times New Roman" w:hAnsi="Times New Roman"/>
+          <w:b/>
+          <w:color w:val="000000"/>
+          <w:sz w:val="22"/>
+        </w:rPr>
+        <w:t>4.</w:t>
+        <w:tab/>
+      </w:r>
+      <w:r>
+        <w:rPr>
+          <w:rFonts w:ascii="Times New Roman" w:hAnsi="Times New Roman"/>
+          <w:b/>
+          <w:color w:val="000000"/>
+          <w:sz w:val="22"/>
+        </w:rPr>
+        <w:t xml:space="preserve">Examine Confirmation Dialog: </w:t>
+      </w:r>
+      <w:r>
+        <w:rPr>
+          <w:rFonts w:ascii="Times New Roman" w:hAnsi="Times New Roman"/>
+          <w:color w:val="000000"/>
+          <w:sz w:val="22"/>
+        </w:rPr>
+        <w:t>The TicketCreatedDialog modal appears on screen displaying Ticket Number #0001, Queue Line Position: 1, and the confirmation status pill reading 'SMS dispatched successfully'. The modal auto-resets after 8 seconds.</w:t>
+      </w:r>
+    </w:p>
+    <w:p>
+      <w:pPr>
+        <w:spacing w:line="276" w:lineRule="auto" w:before="0" w:after="70"/>
+        <w:ind w:left="504" w:hanging="504"/>
+      </w:pPr>
+      <w:r>
+        <w:rPr>
+          <w:rFonts w:ascii="Times New Roman" w:hAnsi="Times New Roman"/>
+          <w:b/>
+          <w:color w:val="000000"/>
+          <w:sz w:val="22"/>
+        </w:rPr>
+        <w:t>5.</w:t>
+        <w:tab/>
+      </w:r>
+      <w:r>
+        <w:rPr>
+          <w:rFonts w:ascii="Times New Roman" w:hAnsi="Times New Roman"/>
+          <w:b/>
+          <w:color w:val="000000"/>
+          <w:sz w:val="22"/>
+        </w:rPr>
+        <w:t xml:space="preserve">Verify Console Audit Log: </w:t>
+      </w:r>
+      <w:r>
+        <w:rPr>
+          <w:rFonts w:ascii="Times New Roman" w:hAnsi="Times New Roman"/>
+          <w:color w:val="000000"/>
+          <w:sz w:val="22"/>
+        </w:rPr>
+        <w:t>Switch to the Kiosk terminal console to observe the asynchronous daemon log output:</w:t>
+        <w:br/>
+        <w:t>📱 [MOCK SMS SIMULATION] To: 09179876543 | Event: CREATED | Ticket: #0001</w:t>
+        <w:br/>
+        <w:t xml:space="preserve">   "Hello Juan Dela Cruz! Ticket #0001 confirmed. Pos: 1. Reason: Enrollment. Watch the display monitor! - TapNQue"</w:t>
+      </w:r>
+    </w:p>
+    <w:p>
+      <w:pPr>
+        <w:keepNext/>
+        <w:spacing w:before="180" w:after="60"/>
+      </w:pPr>
+      <w:r>
+        <w:rPr>
+          <w:rFonts w:ascii="Times New Roman" w:hAnsi="Times New Roman"/>
+          <w:b/>
+          <w:color w:val="000000"/>
+          <w:sz w:val="23"/>
+        </w:rPr>
+        <w:t>Phase 3: Service Ticket at Staff Service Desk (Trigger 2: CALLED &amp; Trigger 3: COMPLETED)</w:t>
+      </w:r>
+    </w:p>
+    <w:p>
+      <w:pPr>
+        <w:spacing w:line="276" w:lineRule="auto" w:before="0" w:after="70"/>
+        <w:ind w:left="504" w:hanging="504"/>
+      </w:pPr>
+      <w:r>
+        <w:rPr>
+          <w:rFonts w:ascii="Times New Roman" w:hAnsi="Times New Roman"/>
+          <w:b/>
+          <w:color w:val="000000"/>
+          <w:sz w:val="22"/>
+        </w:rPr>
+        <w:t>1.</w:t>
+        <w:tab/>
+      </w:r>
+      <w:r>
+        <w:rPr>
+          <w:rFonts w:ascii="Times New Roman" w:hAnsi="Times New Roman"/>
+          <w:b/>
+          <w:color w:val="000000"/>
+          <w:sz w:val="22"/>
+        </w:rPr>
+        <w:t xml:space="preserve">Launch Staff Service Desk: </w:t>
+      </w:r>
+      <w:r>
+        <w:rPr>
+          <w:rFonts w:ascii="Times New Roman" w:hAnsi="Times New Roman"/>
+          <w:color w:val="000000"/>
+          <w:sz w:val="22"/>
+        </w:rPr>
+        <w:t>In a third terminal window, launch the Staff Admin interface: python run_staff.py. Log in using credentials (Username: staff, Password: staff123).</w:t>
+      </w:r>
+    </w:p>
+    <w:p>
+      <w:pPr>
+        <w:spacing w:line="276" w:lineRule="auto" w:before="0" w:after="70"/>
+        <w:ind w:left="504" w:hanging="504"/>
+      </w:pPr>
+      <w:r>
+        <w:rPr>
+          <w:rFonts w:ascii="Times New Roman" w:hAnsi="Times New Roman"/>
+          <w:b/>
+          <w:color w:val="000000"/>
+          <w:sz w:val="22"/>
+        </w:rPr>
+        <w:t>2.</w:t>
+        <w:tab/>
+      </w:r>
+      <w:r>
+        <w:rPr>
+          <w:rFonts w:ascii="Times New Roman" w:hAnsi="Times New Roman"/>
+          <w:b/>
+          <w:color w:val="000000"/>
+          <w:sz w:val="22"/>
+        </w:rPr>
+        <w:t xml:space="preserve">Inspect Waiting Queue: </w:t>
+      </w:r>
+      <w:r>
+        <w:rPr>
+          <w:rFonts w:ascii="Times New Roman" w:hAnsi="Times New Roman"/>
+          <w:color w:val="000000"/>
+          <w:sz w:val="22"/>
+        </w:rPr>
+        <w:t>Ensure Counter selector is set to Counter 1. Observe Ticket #0001 (Juan Dela Cruz) seated at the head of the priority-sorted waiting queue table.</w:t>
+      </w:r>
+    </w:p>
+    <w:p>
+      <w:pPr>
+        <w:spacing w:line="276" w:lineRule="auto" w:before="0" w:after="70"/>
+        <w:ind w:left="504" w:hanging="504"/>
+      </w:pPr>
+      <w:r>
+        <w:rPr>
+          <w:rFonts w:ascii="Times New Roman" w:hAnsi="Times New Roman"/>
+          <w:b/>
+          <w:color w:val="000000"/>
+          <w:sz w:val="22"/>
+        </w:rPr>
+        <w:t>3.</w:t>
+        <w:tab/>
+      </w:r>
+      <w:r>
+        <w:rPr>
+          <w:rFonts w:ascii="Times New Roman" w:hAnsi="Times New Roman"/>
+          <w:b/>
+          <w:color w:val="000000"/>
+          <w:sz w:val="22"/>
+        </w:rPr>
+        <w:t xml:space="preserve">Trigger Called Notification: </w:t>
+      </w:r>
+      <w:r>
+        <w:rPr>
+          <w:rFonts w:ascii="Times New Roman" w:hAnsi="Times New Roman"/>
+          <w:color w:val="000000"/>
+          <w:sz w:val="22"/>
+        </w:rPr>
+        <w:t>Click CALL NEXT (Trigger 2):</w:t>
+        <w:br/>
+        <w:t>• The Active Serving Card illuminates with Ticket #0001 assigned to Counter 1.</w:t>
+        <w:br/>
+        <w:t>• The lobby TV display pulses an acoustic chime and animated border flash.</w:t>
+        <w:br/>
+        <w:t>• The terminal console outputs the outbound alert:</w:t>
+        <w:br/>
+        <w:t xml:space="preserve">  📱 [MOCK SMS SIMULATION] To: 09179876543 | Event: CALLED | Ticket: #0001</w:t>
+        <w:br/>
+        <w:t xml:space="preserve">     "NOW SERVING: Ticket #0001 (Juan Dela Cruz)! Please proceed to Counter 1 immediately. - TapNQue"</w:t>
+      </w:r>
+    </w:p>
+    <w:p>
+      <w:pPr>
+        <w:spacing w:line="276" w:lineRule="auto" w:before="0" w:after="70"/>
+        <w:ind w:left="504" w:hanging="504"/>
+      </w:pPr>
+      <w:r>
+        <w:rPr>
+          <w:rFonts w:ascii="Times New Roman" w:hAnsi="Times New Roman"/>
+          <w:b/>
+          <w:color w:val="000000"/>
+          <w:sz w:val="22"/>
+        </w:rPr>
+        <w:t>4.</w:t>
+        <w:tab/>
+      </w:r>
+      <w:r>
+        <w:rPr>
+          <w:rFonts w:ascii="Times New Roman" w:hAnsi="Times New Roman"/>
+          <w:b/>
+          <w:color w:val="000000"/>
+          <w:sz w:val="22"/>
+        </w:rPr>
+        <w:t xml:space="preserve">Test Absentee Recall: </w:t>
+      </w:r>
+      <w:r>
+        <w:rPr>
+          <w:rFonts w:ascii="Times New Roman" w:hAnsi="Times New Roman"/>
+          <w:color w:val="000000"/>
+          <w:sz w:val="22"/>
+        </w:rPr>
+        <w:t>(Optional Recall Verification): Click the RECALL button. Confirm that the lobby display re-triggers call animations and a renewed SMS alert is output to the terminal console.</w:t>
+      </w:r>
+    </w:p>
+    <w:p>
+      <w:pPr>
+        <w:spacing w:line="276" w:lineRule="auto" w:before="0" w:after="70"/>
+        <w:ind w:left="504" w:hanging="504"/>
+      </w:pPr>
+      <w:r>
+        <w:rPr>
+          <w:rFonts w:ascii="Times New Roman" w:hAnsi="Times New Roman"/>
+          <w:b/>
+          <w:color w:val="000000"/>
+          <w:sz w:val="22"/>
+        </w:rPr>
+        <w:t>5.</w:t>
+        <w:tab/>
+      </w:r>
+      <w:r>
+        <w:rPr>
+          <w:rFonts w:ascii="Times New Roman" w:hAnsi="Times New Roman"/>
+          <w:b/>
+          <w:color w:val="000000"/>
+          <w:sz w:val="22"/>
+        </w:rPr>
+        <w:t xml:space="preserve">Trigger Completed Notification: </w:t>
+      </w:r>
+      <w:r>
+        <w:rPr>
+          <w:rFonts w:ascii="Times New Roman" w:hAnsi="Times New Roman"/>
+          <w:color w:val="000000"/>
+          <w:sz w:val="22"/>
+        </w:rPr>
+        <w:t>Click MARK DONE (Trigger 3):</w:t>
+        <w:br/>
+        <w:t>• The transaction is finalized, wait time is logged, and the ticket moves to service history.</w:t>
+        <w:br/>
+        <w:t>• The terminal console outputs the final completion notification:</w:t>
+        <w:br/>
+        <w:t xml:space="preserve">  📱 [MOCK SMS SIMULATION] To: 09179876543 | Event: COMPLETED | Ticket: #0001</w:t>
+        <w:br/>
+        <w:t xml:space="preserve">     "Ticket #0001 marked as completed. Thank you for visiting TapNQue!"</w:t>
+      </w:r>
+    </w:p>
+    <w:p>
+      <w:pPr>
+        <w:keepNext/>
+        <w:spacing w:before="180" w:after="60"/>
+      </w:pPr>
+      <w:r>
+        <w:rPr>
+          <w:rFonts w:ascii="Times New Roman" w:hAnsi="Times New Roman"/>
+          <w:b/>
+          <w:color w:val="000000"/>
+          <w:sz w:val="23"/>
+        </w:rPr>
+        <w:t>Phase 4: Verify Audit Trail &amp; Database Records in SQLite</w:t>
+      </w:r>
+    </w:p>
+    <w:p>
+      <w:pPr>
+        <w:spacing w:line="276" w:lineRule="auto" w:before="0" w:after="70"/>
+        <w:ind w:left="504" w:hanging="504"/>
+      </w:pPr>
+      <w:r>
+        <w:rPr>
+          <w:rFonts w:ascii="Times New Roman" w:hAnsi="Times New Roman"/>
+          <w:b/>
+          <w:color w:val="000000"/>
+          <w:sz w:val="22"/>
+        </w:rPr>
+        <w:t>1.</w:t>
+        <w:tab/>
+      </w:r>
+      <w:r>
+        <w:rPr>
+          <w:rFonts w:ascii="Times New Roman" w:hAnsi="Times New Roman"/>
+          <w:b/>
+          <w:color w:val="000000"/>
+          <w:sz w:val="22"/>
+        </w:rPr>
+        <w:t xml:space="preserve">Open Audit Modal: </w:t>
+      </w:r>
+      <w:r>
+        <w:rPr>
+          <w:rFonts w:ascii="Times New Roman" w:hAnsi="Times New Roman"/>
+          <w:color w:val="000000"/>
+          <w:sz w:val="22"/>
+        </w:rPr>
+        <w:t>Return to the Super Admin window &gt; Settings tab &gt; click VIEW MOCK SMS LOGS.</w:t>
+      </w:r>
+    </w:p>
+    <w:p>
+      <w:pPr>
+        <w:spacing w:line="276" w:lineRule="auto" w:before="0" w:after="70"/>
+        <w:ind w:left="504" w:hanging="504"/>
+      </w:pPr>
+      <w:r>
+        <w:rPr>
+          <w:rFonts w:ascii="Times New Roman" w:hAnsi="Times New Roman"/>
+          <w:b/>
+          <w:color w:val="000000"/>
+          <w:sz w:val="22"/>
+        </w:rPr>
+        <w:t>2.</w:t>
+        <w:tab/>
+      </w:r>
+      <w:r>
+        <w:rPr>
+          <w:rFonts w:ascii="Times New Roman" w:hAnsi="Times New Roman"/>
+          <w:b/>
+          <w:color w:val="000000"/>
+          <w:sz w:val="22"/>
+        </w:rPr>
+        <w:t xml:space="preserve">Verify GUI Audit Log: </w:t>
+      </w:r>
+      <w:r>
+        <w:rPr>
+          <w:rFonts w:ascii="Times New Roman" w:hAnsi="Times New Roman"/>
+          <w:color w:val="000000"/>
+          <w:sz w:val="22"/>
+        </w:rPr>
+        <w:t>Review the session audit log table. Confirm all three transaction events (CREATED, CALLED, COMPLETED) are chronologically documented with exact timestamps, formatted mobile numbers, and complete message bodies.</w:t>
+      </w:r>
+    </w:p>
+    <w:p>
+      <w:pPr>
+        <w:spacing w:line="276" w:lineRule="auto" w:before="0" w:after="70"/>
+        <w:ind w:left="504" w:hanging="504"/>
+      </w:pPr>
+      <w:r>
+        <w:rPr>
+          <w:rFonts w:ascii="Times New Roman" w:hAnsi="Times New Roman"/>
+          <w:b/>
+          <w:color w:val="000000"/>
+          <w:sz w:val="22"/>
+        </w:rPr>
+        <w:t>3.</w:t>
+        <w:tab/>
+      </w:r>
+      <w:r>
+        <w:rPr>
+          <w:rFonts w:ascii="Times New Roman" w:hAnsi="Times New Roman"/>
+          <w:b/>
+          <w:color w:val="000000"/>
+          <w:sz w:val="22"/>
+        </w:rPr>
+        <w:t xml:space="preserve">Verify Database Records: </w:t>
+      </w:r>
+      <w:r>
+        <w:rPr>
+          <w:rFonts w:ascii="Times New Roman" w:hAnsi="Times New Roman"/>
+          <w:color w:val="000000"/>
+          <w:sz w:val="22"/>
+        </w:rPr>
+        <w:t>Query the local SQLite database from a terminal to verify thread-safe state persistence:</w:t>
+        <w:br/>
+        <w:t>python -c "import sqlite3; conn = sqlite3.connect('data/kiosk.db'); print(conn.execute('SELECT ticket_number, phone_formatted, sms_status_created, sms_status_called, sms_status_completed FROM tickets WHERE ticket_number=1').fetchone())"</w:t>
+      </w:r>
+    </w:p>
+    <w:p>
+      <w:pPr>
+        <w:spacing w:line="276" w:lineRule="auto" w:before="0" w:after="70"/>
+        <w:ind w:left="504" w:hanging="504"/>
+      </w:pPr>
+      <w:r>
+        <w:rPr>
+          <w:rFonts w:ascii="Times New Roman" w:hAnsi="Times New Roman"/>
+          <w:b/>
+          <w:color w:val="000000"/>
+          <w:sz w:val="22"/>
+        </w:rPr>
+        <w:t>4.</w:t>
+        <w:tab/>
+      </w:r>
+      <w:r>
+        <w:rPr>
+          <w:rFonts w:ascii="Times New Roman" w:hAnsi="Times New Roman"/>
+          <w:b/>
+          <w:color w:val="000000"/>
+          <w:sz w:val="22"/>
+        </w:rPr>
+        <w:t xml:space="preserve">Inspect Database Result: </w:t>
+      </w:r>
+      <w:r>
+        <w:rPr>
+          <w:rFonts w:ascii="Times New Roman" w:hAnsi="Times New Roman"/>
+          <w:color w:val="000000"/>
+          <w:sz w:val="22"/>
+        </w:rPr>
+        <w:t>Confirm terminal query output returns:</w:t>
+        <w:br/>
+        <w:t>(1, '09179876543', 'mock_sent', 'mock_sent', 'mock_sent')</w:t>
+      </w:r>
+    </w:p>
+    <w:p>
+      <w:pPr>
+        <w:keepNext/>
+        <w:spacing w:before="280" w:after="80"/>
+      </w:pPr>
+      <w:r>
+        <w:rPr>
+          <w:rFonts w:ascii="Times New Roman" w:hAnsi="Times New Roman"/>
+          <w:b/>
+          <w:color w:val="000000"/>
+          <w:sz w:val="26"/>
+        </w:rPr>
+        <w:t>7. Safe Capstone Mock Simulation Mode</w:t>
       </w:r>
     </w:p>
     <w:p>
@@ -4208,7 +4993,7 @@
           <w:color w:val="000000"/>
           <w:sz w:val="26"/>
         </w:rPr>
-        <w:t>7. Step-by-Step Deployment &amp; Operations Guide</w:t>
+        <w:t>8. Step-by-Step Deployment &amp; Operations Guide</w:t>
       </w:r>
     </w:p>
     <w:p>
@@ -4237,7 +5022,7 @@
           <w:color w:val="000000"/>
           <w:sz w:val="23"/>
         </w:rPr>
-        <w:t>7.1 Environment Setup &amp; Installation</w:t>
+        <w:t>8.1 Environment Setup &amp; Installation</w:t>
       </w:r>
     </w:p>
     <w:p>
@@ -4384,7 +5169,7 @@
           <w:color w:val="000000"/>
           <w:sz w:val="23"/>
         </w:rPr>
-        <w:t>7.2 Launching System Stations</w:t>
+        <w:t>8.2 Launching System Stations</w:t>
       </w:r>
     </w:p>
     <w:tbl>
@@ -4935,7 +5720,7 @@
           <w:color w:val="000000"/>
           <w:sz w:val="26"/>
         </w:rPr>
-        <w:t>8. Database Schema &amp; Data Dictionary</w:t>
+        <w:t>9. Database Schema &amp; Data Dictionary</w:t>
       </w:r>
     </w:p>
     <w:p>
@@ -4964,7 +5749,7 @@
           <w:color w:val="000000"/>
           <w:sz w:val="23"/>
         </w:rPr>
-        <w:t>8.1 Tickets Table Schema</w:t>
+        <w:t>9.1 Tickets Table Schema</w:t>
       </w:r>
     </w:p>
     <w:tbl>
@@ -6915,7 +7700,7 @@
           <w:color w:val="000000"/>
           <w:sz w:val="23"/>
         </w:rPr>
-        <w:t>8.2 Settings Table Schema</w:t>
+        <w:t>9.2 Settings Table Schema</w:t>
       </w:r>
     </w:p>
     <w:p>
@@ -7141,7 +7926,7 @@
         <w:color w:val="000000"/>
         <w:sz w:val="18"/>
       </w:rPr>
-      <w:t>TapNQue • PhilSMS Cloud API System Guide &amp; Setup Manual (Doc ID: TNQ-DOC-MAN-2026-03-PHILSMS)</w:t>
+      <w:t>TapNQue • PhilSMS Cloud API System Guide &amp; Walkthrough Manual (Doc ID: TNQ-DOC-MAN-2026-03-PHILSMS)</w:t>
     </w:r>
   </w:p>
 </w:ftr>

</xml_diff>

<commit_message>
fix(philsms): migrate gateway endpoint to dashboard.philsms.com for OAuth v3 authentication
</commit_message>
<xml_diff>
--- a/docs/11-09-2026_TapNQue_Comprehensive_System_Guide_and_PhilSMS_Manual.docx
+++ b/docs/11-09-2026_TapNQue_Comprehensive_System_Guide_and_PhilSMS_Manual.docx
@@ -70,7 +70,7 @@
           <w:color w:val="000000"/>
           <w:sz w:val="19"/>
         </w:rPr>
-        <w:t>Outbound SMS Protocol: PhilSMS Cloud REST API (https://app.philsms.com/api/v3/sms/send) + Safe Mock Mode</w:t>
+        <w:t>Outbound SMS Protocol: PhilSMS Cloud REST API (https://dashboard.philsms.com/api/v3/sms/send) + Safe Mock Mode</w:t>
         <w:br/>
       </w:r>
       <w:r>
@@ -1798,7 +1798,7 @@
           <w:color w:val="000000"/>
           <w:sz w:val="22"/>
         </w:rPr>
-        <w:t>https://app.philsms.com/api/v3/sms/send</w:t>
+        <w:t>https://dashboard.philsms.com/api/v3/sms/send</w:t>
       </w:r>
     </w:p>
     <w:p>
@@ -1892,7 +1892,7 @@
         </w:rPr>
         <w:t>{</w:t>
         <w:br/>
-        <w:t xml:space="preserve">  "recipient": "09171234567",</w:t>
+        <w:t xml:space="preserve">  "recipient": "639171234567",</w:t>
         <w:br/>
         <w:t xml:space="preserve">  "sender_id": "PhilSMS",</w:t>
         <w:br/>
@@ -2478,7 +2478,7 @@
           <w:color w:val="000000"/>
           <w:sz w:val="22"/>
         </w:rPr>
-        <w:t>Open an internet browser and navigate to the official portal at https://app.philsms.com/.</w:t>
+        <w:t>Open an internet browser and navigate to the official portal at https://dashboard.philsms.com/.</w:t>
       </w:r>
     </w:p>
     <w:p>
@@ -2577,7 +2577,7 @@
           <w:color w:val="000000"/>
           <w:sz w:val="22"/>
         </w:rPr>
-        <w:t>Log in to the PhilSMS dashboard at https://app.philsms.com/login to confirm your account status.</w:t>
+        <w:t>Log in to the PhilSMS dashboard at https://dashboard.philsms.com/login to confirm your account status.</w:t>
       </w:r>
     </w:p>
     <w:p>
@@ -3195,7 +3195,7 @@
           <w:color w:val="000000"/>
           <w:sz w:val="22"/>
         </w:rPr>
-        <w:t>Verify that the Gateway URL is set to https://app.philsms.com/api/v3/sms/send.</w:t>
+        <w:t>Verify that the PhilSMS API Endpoint is set to https://dashboard.philsms.com/api/v3/sms/send.</w:t>
       </w:r>
     </w:p>
     <w:p>
@@ -3305,7 +3305,7 @@
           <w:color w:val="000000"/>
           <w:sz w:val="22"/>
         </w:rPr>
-        <w:t>TAPNQUE_SMS_GATEWAY_URL=https://app.philsms.com/api/v3/sms/send</w:t>
+        <w:t>TAPNQUE_SMS_GATEWAY_URL=https://dashboard.philsms.com/api/v3/sms/send</w:t>
         <w:br/>
         <w:t>TAPNQUE_SMS_API_KEY=your_philsms_api_token_here</w:t>
         <w:br/>
@@ -3985,7 +3985,7 @@
                 <w:color w:val="000000"/>
                 <w:sz w:val="19"/>
               </w:rPr>
-              <w:t>Log in to https://app.philsms.com/ and reload credits via GCash or Maya.</w:t>
+              <w:t>Log in to https://dashboard.philsms.com/ and reload credits via GCash or Maya.</w:t>
             </w:r>
           </w:p>
         </w:tc>
@@ -4213,7 +4213,7 @@
           <w:color w:val="000000"/>
           <w:sz w:val="22"/>
         </w:rPr>
-        <w:t>Ensure your active PhilSMS secret Bearer Token is entered into the PhilSMS API Token / Bearer Key field, and Sender ID is set to PhilSMS.</w:t>
+        <w:t>Ensure the PhilSMS API Endpoint is set to https://dashboard.philsms.com/api/v3/sms/send, enter your active PhilSMS secret Bearer Token into the PhilSMS API Token / Bearer Key field, and confirm Sender ID is set to PhilSMS.</w:t>
       </w:r>
     </w:p>
     <w:p>
@@ -4603,7 +4603,7 @@
           <w:color w:val="000000"/>
           <w:sz w:val="22"/>
         </w:rPr>
-        <w:t>Observe the Kiosk terminal console: the asynchronous daemon logs the live dispatch and records an HTTP 200 OK response from https://app.philsms.com/api/v3/sms/send.</w:t>
+        <w:t>Observe the Kiosk terminal console: the asynchronous daemon logs the live dispatch and records an HTTP 200 OK response from https://dashboard.philsms.com/api/v3/sms/send.</w:t>
       </w:r>
     </w:p>
     <w:p>
@@ -4917,7 +4917,7 @@
           <w:color w:val="000000"/>
           <w:sz w:val="22"/>
         </w:rPr>
-        <w:t>Log in to the PhilSMS Web Portal at https://app.philsms.com/login and navigate to Outbox / SMS History to review carrier timestamps, telco routing networks (Smart/Globe/Dito), and deducted balance.</w:t>
+        <w:t>Log in to the PhilSMS Web Portal at https://dashboard.philsms.com/login and navigate to Outbox / SMS History to review carrier timestamps, telco routing networks (Smart/Globe/Dito), and deducted balance.</w:t>
       </w:r>
     </w:p>
     <w:p>
@@ -7845,7 +7845,7 @@
           <w:color w:val="000000"/>
           <w:sz w:val="22"/>
         </w:rPr>
-        <w:t>URL for PhilSMS endpoint (default: https://app.philsms.com/api/v3/sms/send).</w:t>
+        <w:t>URL for PhilSMS endpoint (default: https://dashboard.philsms.com/api/v3/sms/send).</w:t>
       </w:r>
     </w:p>
     <w:p>

</xml_diff>